<commit_message>
cap nhat danh sach tiep nhan tieng Viet co dau dung chinh ta
</commit_message>
<xml_diff>
--- a/DanhSachTiepNhan.docx
+++ b/DanhSachTiepNhan.docx
@@ -18,7 +18,7 @@
           <w:b/>
           <w:sz w:val="32"/>
         </w:rPr>
-        <w:t>TAI LIEU PHAN TICH MA NGUON: DANH SACH BENH NHAN DA TIEP DON</w:t>
+        <w:t>TÀI LIỆU PHÂN TÍCH MÃ NGUỒN PHÂN HỆ: DANH SÁCH BỆNH NHÂN ĐÃ TIẾP ĐÓN</w:t>
       </w:r>
     </w:p>
     <w:p>
@@ -35,7 +35,7 @@
           <w:rFonts w:ascii="Times New Roman" w:hAnsi="Times New Roman" w:cs="Times New Roman"/>
           <w:sz w:val="26"/>
         </w:rPr>
-        <w:t>Tai lieu nay mo ta chi tiet nghiep vu, co so du lieu SQL Server, ma nguon Backend (C# ASP.NET Core) va ma nguon Frontend (ReactJS, Tailwind CSS) cua module Danh sach benh nhan da tiep don.</w:t>
+        <w:t>Tài liệu này mô tả chi tiết nghiệp vụ, cấu trúc cơ sở dữ liệu SQL Server, mã nguồn Backend (C# ASP.NET Core) và mã nguồn Frontend (ReactJS &amp; Tailwind CSS) của phân hệ Danh sách bệnh nhân đã tiếp đón tại phòng khám.</w:t>
       </w:r>
     </w:p>
     <w:p>
@@ -53,7 +53,7 @@
           <w:b/>
           <w:sz w:val="28"/>
         </w:rPr>
-        <w:t>1. MIEU TA NGHIEP VU CHUC NANG</w:t>
+        <w:t>1. MIÊU TẢ NGHIỆP VỤ CHỨC NĂNG</w:t>
       </w:r>
     </w:p>
     <w:p>
@@ -70,7 +70,7 @@
           <w:rFonts w:ascii="Times New Roman" w:hAnsi="Times New Roman" w:cs="Times New Roman"/>
           <w:sz w:val="26"/>
         </w:rPr>
-        <w:t>Chuc nang Danh sach benh nhan da tiep don giup nhan vien Le tan va cac Bac si co the:</w:t>
+        <w:t>Chức năng Danh sách bệnh nhân đã tiếp đón giúp nhân viên Lễ tân và các Bác sĩ có thể thực hiện:</w:t>
       </w:r>
     </w:p>
     <w:p>
@@ -87,22 +87,22 @@
           <w:rFonts w:ascii="Times New Roman" w:hAnsi="Times New Roman" w:cs="Times New Roman"/>
           <w:sz w:val="26"/>
         </w:rPr>
-        <w:t xml:space="preserve">   *   </w:t>
-      </w:r>
-      <w:r>
-        <w:rPr>
-          <w:rFonts w:ascii="Times New Roman" w:hAnsi="Times New Roman" w:cs="Times New Roman"/>
-          <w:b/>
-          <w:sz w:val="26"/>
-        </w:rPr>
-        <w:t xml:space="preserve">Tra cuu va Loc: </w:t>
-      </w:r>
-      <w:r>
-        <w:rPr>
-          <w:rFonts w:ascii="Times New Roman" w:hAnsi="Times New Roman" w:cs="Times New Roman"/>
-          <w:sz w:val="26"/>
-        </w:rPr>
-        <w:t>Tra cuu danh sach benh nhan da duoc tiep nhan theo Ngay kham (mac dinh la ngay hom nay), trang thai kham (Cho kham, Dang kham, Cho CLS, Hoan thanh), hoac tim kiem nhanh theo Ten, So dien thoai, Ma benh nhan.</w:t>
+        <w:t xml:space="preserve">   â€¢   </w:t>
+      </w:r>
+      <w:r>
+        <w:rPr>
+          <w:rFonts w:ascii="Times New Roman" w:hAnsi="Times New Roman" w:cs="Times New Roman"/>
+          <w:b/>
+          <w:sz w:val="26"/>
+        </w:rPr>
+        <w:t xml:space="preserve">Tra cứu và Lọc nhanh: </w:t>
+      </w:r>
+      <w:r>
+        <w:rPr>
+          <w:rFonts w:ascii="Times New Roman" w:hAnsi="Times New Roman" w:cs="Times New Roman"/>
+          <w:sz w:val="26"/>
+        </w:rPr>
+        <w:t>Tra cứu danh sách bệnh nhân đã được tiếp nhận trong ngày theo Ngày khám (mặc định là ngày hôm nay), bộ lọc trạng thái khám (Chờ khám, Đang khám, Chờ CLS, Hoàn thành) hoặc tìm kiếm theo Họ tên, Số điện thoại hoặc Mã bệnh nhân.</w:t>
       </w:r>
     </w:p>
     <w:p>
@@ -119,22 +119,22 @@
           <w:rFonts w:ascii="Times New Roman" w:hAnsi="Times New Roman" w:cs="Times New Roman"/>
           <w:sz w:val="26"/>
         </w:rPr>
-        <w:t xml:space="preserve">   *   </w:t>
-      </w:r>
-      <w:r>
-        <w:rPr>
-          <w:rFonts w:ascii="Times New Roman" w:hAnsi="Times New Roman" w:cs="Times New Roman"/>
-          <w:b/>
-          <w:sz w:val="26"/>
-        </w:rPr>
-        <w:t xml:space="preserve">Theo doi trang thai: </w:t>
-      </w:r>
-      <w:r>
-        <w:rPr>
-          <w:rFonts w:ascii="Times New Roman" w:hAnsi="Times New Roman" w:cs="Times New Roman"/>
-          <w:sz w:val="26"/>
-        </w:rPr>
-        <w:t>Giam sat quy trinh kham cua tung benh nhan thong qua cac nhan mau sac bat mat tuong ung voi tung trang thai.</w:t>
+        <w:t xml:space="preserve">   â€¢   </w:t>
+      </w:r>
+      <w:r>
+        <w:rPr>
+          <w:rFonts w:ascii="Times New Roman" w:hAnsi="Times New Roman" w:cs="Times New Roman"/>
+          <w:b/>
+          <w:sz w:val="26"/>
+        </w:rPr>
+        <w:t xml:space="preserve">Theo dõi tiến độ khám: </w:t>
+      </w:r>
+      <w:r>
+        <w:rPr>
+          <w:rFonts w:ascii="Times New Roman" w:hAnsi="Times New Roman" w:cs="Times New Roman"/>
+          <w:sz w:val="26"/>
+        </w:rPr>
+        <w:t>Giám sát quy trình khám bệnh của từng người bệnh thông qua các nhãn màu sắc trực quan (Badge) tương ứng với từng trạng thái.</w:t>
       </w:r>
     </w:p>
     <w:p>
@@ -151,22 +151,22 @@
           <w:rFonts w:ascii="Times New Roman" w:hAnsi="Times New Roman" w:cs="Times New Roman"/>
           <w:sz w:val="26"/>
         </w:rPr>
-        <w:t xml:space="preserve">   *   </w:t>
-      </w:r>
-      <w:r>
-        <w:rPr>
-          <w:rFonts w:ascii="Times New Roman" w:hAnsi="Times New Roman" w:cs="Times New Roman"/>
-          <w:b/>
-          <w:sz w:val="26"/>
-        </w:rPr>
-        <w:t xml:space="preserve">Lien ket xem benh an: </w:t>
-      </w:r>
-      <w:r>
-        <w:rPr>
-          <w:rFonts w:ascii="Times New Roman" w:hAnsi="Times New Roman" w:cs="Times New Roman"/>
-          <w:sz w:val="26"/>
-        </w:rPr>
-        <w:t>Nhan vao ten benh nhan hoac bieu tuong hanh dong de di nhanh toi chi tiet ho so benh an phuc vu cho viec kham va cap toa thuoc.</w:t>
+        <w:t xml:space="preserve">   â€¢   </w:t>
+      </w:r>
+      <w:r>
+        <w:rPr>
+          <w:rFonts w:ascii="Times New Roman" w:hAnsi="Times New Roman" w:cs="Times New Roman"/>
+          <w:b/>
+          <w:sz w:val="26"/>
+        </w:rPr>
+        <w:t xml:space="preserve">Chuyển tiếp nhanh: </w:t>
+      </w:r>
+      <w:r>
+        <w:rPr>
+          <w:rFonts w:ascii="Times New Roman" w:hAnsi="Times New Roman" w:cs="Times New Roman"/>
+          <w:sz w:val="26"/>
+        </w:rPr>
+        <w:t>Nhấn vào tên bệnh nhân hoặc biểu tượng hành động để chuyển tiếp nhanh sang phân hệ Khám bệnh chi tiết phục vụ khám lâm sàng và kê toa thuốc.</w:t>
       </w:r>
     </w:p>
     <w:p>
@@ -184,7 +184,7 @@
           <w:b/>
           <w:sz w:val="28"/>
         </w:rPr>
-        <w:t>2. THIET KE CO SO DU LIEU (SQL SERVER)</w:t>
+        <w:t>2. THIẾT BẾ CƠ SỞ DỮ LIỆU (SQL SERVER)</w:t>
       </w:r>
     </w:p>
     <w:p>
@@ -201,7 +201,7 @@
           <w:rFonts w:ascii="Times New Roman" w:hAnsi="Times New Roman" w:cs="Times New Roman"/>
           <w:sz w:val="26"/>
         </w:rPr>
-        <w:t>Du lieu cua module nay duoc luu tru va ket noi tu cac bang database chinh sau:</w:t>
+        <w:t>Dữ liệu của module này được khai thác từ các bảng database chính bao gồm:</w:t>
       </w:r>
     </w:p>
     <w:p>
@@ -218,22 +218,22 @@
           <w:rFonts w:ascii="Times New Roman" w:hAnsi="Times New Roman" w:cs="Times New Roman"/>
           <w:sz w:val="26"/>
         </w:rPr>
-        <w:t xml:space="preserve">   *   </w:t>
-      </w:r>
-      <w:r>
-        <w:rPr>
-          <w:rFonts w:ascii="Times New Roman" w:hAnsi="Times New Roman" w:cs="Times New Roman"/>
-          <w:b/>
-          <w:sz w:val="26"/>
-        </w:rPr>
-        <w:t xml:space="preserve">PhieuKham: </w:t>
-      </w:r>
-      <w:r>
-        <w:rPr>
-          <w:rFonts w:ascii="Times New Roman" w:hAnsi="Times New Roman" w:cs="Times New Roman"/>
-          <w:sz w:val="26"/>
-        </w:rPr>
-        <w:t>Luu thong tin luot tiep don (MaPhieu, MaBN, NgayKham, TrangThaiKham, MaBacSiChiDinh, LyDoKham, v.v.).</w:t>
+        <w:t xml:space="preserve">   â€¢   </w:t>
+      </w:r>
+      <w:r>
+        <w:rPr>
+          <w:rFonts w:ascii="Times New Roman" w:hAnsi="Times New Roman" w:cs="Times New Roman"/>
+          <w:b/>
+          <w:sz w:val="26"/>
+        </w:rPr>
+        <w:t xml:space="preserve">Bảng PhieuKham: </w:t>
+      </w:r>
+      <w:r>
+        <w:rPr>
+          <w:rFonts w:ascii="Times New Roman" w:hAnsi="Times New Roman" w:cs="Times New Roman"/>
+          <w:sz w:val="26"/>
+        </w:rPr>
+        <w:t>Lưu thông tin lượt tiếp đón hành chính (MaPhieu, MaBN, NgayKham, TrangThaiKham, MaNVBacSi, LyDoKham).</w:t>
       </w:r>
     </w:p>
     <w:p>
@@ -250,22 +250,22 @@
           <w:rFonts w:ascii="Times New Roman" w:hAnsi="Times New Roman" w:cs="Times New Roman"/>
           <w:sz w:val="26"/>
         </w:rPr>
-        <w:t xml:space="preserve">   *   </w:t>
-      </w:r>
-      <w:r>
-        <w:rPr>
-          <w:rFonts w:ascii="Times New Roman" w:hAnsi="Times New Roman" w:cs="Times New Roman"/>
-          <w:b/>
-          <w:sz w:val="26"/>
-        </w:rPr>
-        <w:t xml:space="preserve">BenhNhan: </w:t>
-      </w:r>
-      <w:r>
-        <w:rPr>
-          <w:rFonts w:ascii="Times New Roman" w:hAnsi="Times New Roman" w:cs="Times New Roman"/>
-          <w:sz w:val="26"/>
-        </w:rPr>
-        <w:t>Luu tru thong tin hanh chinh cua benh nhan (MaBN, HoTen, NgaySinh, GioiTinh, Sdt, DiaChi, v.v.).</w:t>
+        <w:t xml:space="preserve">   â€¢   </w:t>
+      </w:r>
+      <w:r>
+        <w:rPr>
+          <w:rFonts w:ascii="Times New Roman" w:hAnsi="Times New Roman" w:cs="Times New Roman"/>
+          <w:b/>
+          <w:sz w:val="26"/>
+        </w:rPr>
+        <w:t xml:space="preserve">Bảng BenhNhan: </w:t>
+      </w:r>
+      <w:r>
+        <w:rPr>
+          <w:rFonts w:ascii="Times New Roman" w:hAnsi="Times New Roman" w:cs="Times New Roman"/>
+          <w:sz w:val="26"/>
+        </w:rPr>
+        <w:t>Lưu trữ thông tin hành chính của bệnh nhân (MaBN, HoTen, NgaySinh, GioiTinh, Sdt, DiaChi, v.v.).</w:t>
       </w:r>
     </w:p>
     <w:p>
@@ -282,22 +282,22 @@
           <w:rFonts w:ascii="Times New Roman" w:hAnsi="Times New Roman" w:cs="Times New Roman"/>
           <w:sz w:val="26"/>
         </w:rPr>
-        <w:t xml:space="preserve">   *   </w:t>
-      </w:r>
-      <w:r>
-        <w:rPr>
-          <w:rFonts w:ascii="Times New Roman" w:hAnsi="Times New Roman" w:cs="Times New Roman"/>
-          <w:b/>
-          <w:sz w:val="26"/>
-        </w:rPr>
-        <w:t xml:space="preserve">NhanVien &amp; DanhMucKhoa: </w:t>
-      </w:r>
-      <w:r>
-        <w:rPr>
-          <w:rFonts w:ascii="Times New Roman" w:hAnsi="Times New Roman" w:cs="Times New Roman"/>
-          <w:sz w:val="26"/>
-        </w:rPr>
-        <w:t>Luu thong tin bac si duoc chi dinh va khoa lam viec cua bac si do.</w:t>
+        <w:t xml:space="preserve">   â€¢   </w:t>
+      </w:r>
+      <w:r>
+        <w:rPr>
+          <w:rFonts w:ascii="Times New Roman" w:hAnsi="Times New Roman" w:cs="Times New Roman"/>
+          <w:b/>
+          <w:sz w:val="26"/>
+        </w:rPr>
+        <w:t xml:space="preserve">Bảng NhanVien &amp; DanhMucKhoa: </w:t>
+      </w:r>
+      <w:r>
+        <w:rPr>
+          <w:rFonts w:ascii="Times New Roman" w:hAnsi="Times New Roman" w:cs="Times New Roman"/>
+          <w:sz w:val="26"/>
+        </w:rPr>
+        <w:t>Lưu thông tin bác sĩ được chỉ định và khoa lâm sàng làm việc của bác sĩ đó.</w:t>
       </w:r>
     </w:p>
     <w:p>
@@ -315,7 +315,7 @@
           <w:b/>
           <w:sz w:val="28"/>
         </w:rPr>
-        <w:t>3. PHAN TICH MA NGUON BACKEND (C# ASP.NET CORE)</w:t>
+        <w:t>3. PHÂN TÍCH MÃ NGUỒN BACKEND (C# ASP.NET CORE)</w:t>
       </w:r>
     </w:p>
     <w:p>
@@ -332,248 +332,247 @@
           <w:rFonts w:ascii="Times New Roman" w:hAnsi="Times New Roman" w:cs="Times New Roman"/>
           <w:sz w:val="26"/>
         </w:rPr>
-        <w:t>Endpoint lay danh sach tiep don duoc dinh nghia trong NhanSuController hoac TiepDonController. O day cu the la HttpGet 'api/TiepDon/danh-sach' tai TiepDonController.cs.</w:t>
-      </w:r>
-    </w:p>
-    <w:p>
-      <w:pPr>
-        <w:spacing w:after="120"/>
-        <w:jc w:val="both"/>
-        <w:rPr>
-          <w:rFonts w:ascii="Times New Roman" w:hAnsi="Times New Roman" w:cs="Times New Roman"/>
-          <w:sz w:val="26"/>
-        </w:rPr>
-      </w:pPr>
-      <w:r>
-        <w:rPr>
-          <w:rFonts w:ascii="Times New Roman" w:hAnsi="Times New Roman" w:cs="Times New Roman"/>
-          <w:sz w:val="26"/>
-        </w:rPr>
-        <w:t>Ma nguon C# xu ly lay danh sach kem theo phan trang va cac bo loc loc theo ngay, trang thai va bac si chi dinh:</w:t>
-      </w:r>
-    </w:p>
-    <w:p>
-      <w:pPr>
-        <w:spacing w:after="80" w:line="240" w:lineRule="auto"/>
-        <w:rPr>
-          <w:rFonts w:ascii="Courier New" w:hAnsi="Courier New" w:cs="Courier New"/>
-          <w:sz w:val="20"/>
-        </w:rPr>
-      </w:pPr>
-      <w:r>
-        <w:rPr>
-          <w:rFonts w:ascii="Courier New" w:hAnsi="Courier New" w:cs="Courier New"/>
-          <w:sz w:val="20"/>
-        </w:rPr>
-        <w:t>[HttpGet("danh-sach")]</w:t>
-      </w:r>
-    </w:p>
-    <w:p>
-      <w:pPr>
-        <w:spacing w:after="80" w:line="240" w:lineRule="auto"/>
-        <w:rPr>
-          <w:rFonts w:ascii="Courier New" w:hAnsi="Courier New" w:cs="Courier New"/>
-          <w:sz w:val="20"/>
-        </w:rPr>
-      </w:pPr>
-      <w:r>
-        <w:rPr>
-          <w:rFonts w:ascii="Courier New" w:hAnsi="Courier New" w:cs="Courier New"/>
-          <w:sz w:val="20"/>
-        </w:rPr>
-        <w:t>[Authorize(Roles = "LeTan,BacSi,Admin")]</w:t>
-      </w:r>
-    </w:p>
-    <w:p>
-      <w:pPr>
-        <w:spacing w:after="80" w:line="240" w:lineRule="auto"/>
-        <w:rPr>
-          <w:rFonts w:ascii="Courier New" w:hAnsi="Courier New" w:cs="Courier New"/>
-          <w:sz w:val="20"/>
-        </w:rPr>
-      </w:pPr>
-      <w:r>
-        <w:rPr>
-          <w:rFonts w:ascii="Courier New" w:hAnsi="Courier New" w:cs="Courier New"/>
-          <w:sz w:val="20"/>
-        </w:rPr>
-        <w:t>public async Task&lt;IActionResult&gt; LayDanhSachTiepDon(</w:t>
-      </w:r>
-    </w:p>
-    <w:p>
-      <w:pPr>
-        <w:spacing w:after="80" w:line="240" w:lineRule="auto"/>
-        <w:rPr>
-          <w:rFonts w:ascii="Courier New" w:hAnsi="Courier New" w:cs="Courier New"/>
-          <w:sz w:val="20"/>
-        </w:rPr>
-      </w:pPr>
-      <w:r>
-        <w:rPr>
-          <w:rFonts w:ascii="Courier New" w:hAnsi="Courier New" w:cs="Courier New"/>
-          <w:sz w:val="20"/>
-        </w:rPr>
-        <w:t xml:space="preserve">    [FromQuery] string? search = null,</w:t>
-      </w:r>
-    </w:p>
-    <w:p>
-      <w:pPr>
-        <w:spacing w:after="80" w:line="240" w:lineRule="auto"/>
-        <w:rPr>
-          <w:rFonts w:ascii="Courier New" w:hAnsi="Courier New" w:cs="Courier New"/>
-          <w:sz w:val="20"/>
-        </w:rPr>
-      </w:pPr>
-      <w:r>
-        <w:rPr>
-          <w:rFonts w:ascii="Courier New" w:hAnsi="Courier New" w:cs="Courier New"/>
-          <w:sz w:val="20"/>
-        </w:rPr>
-        <w:t xml:space="preserve">    [FromQuery] string? maBacSi = null,</w:t>
-      </w:r>
-    </w:p>
-    <w:p>
-      <w:pPr>
-        <w:spacing w:after="80" w:line="240" w:lineRule="auto"/>
-        <w:rPr>
-          <w:rFonts w:ascii="Courier New" w:hAnsi="Courier New" w:cs="Courier New"/>
-          <w:sz w:val="20"/>
-        </w:rPr>
-      </w:pPr>
-      <w:r>
-        <w:rPr>
-          <w:rFonts w:ascii="Courier New" w:hAnsi="Courier New" w:cs="Courier New"/>
-          <w:sz w:val="20"/>
-        </w:rPr>
-        <w:t xml:space="preserve">    [FromQuery] int? trangThai = null,</w:t>
-      </w:r>
-    </w:p>
-    <w:p>
-      <w:pPr>
-        <w:spacing w:after="80" w:line="240" w:lineRule="auto"/>
-        <w:rPr>
-          <w:rFonts w:ascii="Courier New" w:hAnsi="Courier New" w:cs="Courier New"/>
-          <w:sz w:val="20"/>
-        </w:rPr>
-      </w:pPr>
-      <w:r>
-        <w:rPr>
-          <w:rFonts w:ascii="Courier New" w:hAnsi="Courier New" w:cs="Courier New"/>
-          <w:sz w:val="20"/>
-        </w:rPr>
-        <w:t xml:space="preserve">    [FromQuery] string? ngayKham = null,</w:t>
-      </w:r>
-    </w:p>
-    <w:p>
-      <w:pPr>
-        <w:spacing w:after="80" w:line="240" w:lineRule="auto"/>
-        <w:rPr>
-          <w:rFonts w:ascii="Courier New" w:hAnsi="Courier New" w:cs="Courier New"/>
-          <w:sz w:val="20"/>
-        </w:rPr>
-      </w:pPr>
-      <w:r>
-        <w:rPr>
-          <w:rFonts w:ascii="Courier New" w:hAnsi="Courier New" w:cs="Courier New"/>
-          <w:sz w:val="20"/>
-        </w:rPr>
-        <w:t xml:space="preserve">    [FromQuery] int page = 1,</w:t>
-      </w:r>
-    </w:p>
-    <w:p>
-      <w:pPr>
-        <w:spacing w:after="80" w:line="240" w:lineRule="auto"/>
-        <w:rPr>
-          <w:rFonts w:ascii="Courier New" w:hAnsi="Courier New" w:cs="Courier New"/>
-          <w:sz w:val="20"/>
-        </w:rPr>
-      </w:pPr>
-      <w:r>
-        <w:rPr>
-          <w:rFonts w:ascii="Courier New" w:hAnsi="Courier New" w:cs="Courier New"/>
-          <w:sz w:val="20"/>
-        </w:rPr>
-        <w:t xml:space="preserve">    [FromQuery] int limit = 100)</w:t>
-      </w:r>
-    </w:p>
-    <w:p>
-      <w:pPr>
-        <w:spacing w:after="80" w:line="240" w:lineRule="auto"/>
-        <w:rPr>
-          <w:rFonts w:ascii="Courier New" w:hAnsi="Courier New" w:cs="Courier New"/>
-          <w:sz w:val="20"/>
-        </w:rPr>
-      </w:pPr>
-      <w:r>
-        <w:rPr>
-          <w:rFonts w:ascii="Courier New" w:hAnsi="Courier New" w:cs="Courier New"/>
-          <w:sz w:val="20"/>
-        </w:rPr>
-        <w:t>{</w:t>
-      </w:r>
-    </w:p>
-    <w:p>
-      <w:pPr>
-        <w:spacing w:after="80" w:line="240" w:lineRule="auto"/>
-        <w:rPr>
-          <w:rFonts w:ascii="Courier New" w:hAnsi="Courier New" w:cs="Courier New"/>
-          <w:sz w:val="20"/>
-        </w:rPr>
-      </w:pPr>
-      <w:r>
-        <w:rPr>
-          <w:rFonts w:ascii="Courier New" w:hAnsi="Courier New" w:cs="Courier New"/>
-          <w:sz w:val="20"/>
-        </w:rPr>
-        <w:t xml:space="preserve">    // Validate parameters, check date format YYYY-MM-DD</w:t>
-      </w:r>
-    </w:p>
-    <w:p>
-      <w:pPr>
-        <w:spacing w:after="80" w:line="240" w:lineRule="auto"/>
-        <w:rPr>
-          <w:rFonts w:ascii="Courier New" w:hAnsi="Courier New" w:cs="Courier New"/>
-          <w:sz w:val="20"/>
-        </w:rPr>
-      </w:pPr>
-      <w:r>
-        <w:rPr>
-          <w:rFonts w:ascii="Courier New" w:hAnsi="Courier New" w:cs="Courier New"/>
-          <w:sz w:val="20"/>
-        </w:rPr>
-        <w:t xml:space="preserve">    // Build query with Include(p =&gt; p.BenhNhan) and filter by conditions</w:t>
-      </w:r>
-    </w:p>
-    <w:p>
-      <w:pPr>
-        <w:spacing w:after="80" w:line="240" w:lineRule="auto"/>
-        <w:rPr>
-          <w:rFonts w:ascii="Courier New" w:hAnsi="Courier New" w:cs="Courier New"/>
-          <w:sz w:val="20"/>
-        </w:rPr>
-      </w:pPr>
-      <w:r>
-        <w:rPr>
-          <w:rFonts w:ascii="Courier New" w:hAnsi="Courier New" w:cs="Courier New"/>
-          <w:sz w:val="20"/>
-        </w:rPr>
-        <w:t xml:space="preserve">    // Return list with pagination metadata</w:t>
-      </w:r>
-    </w:p>
-    <w:p>
-      <w:pPr>
-        <w:spacing w:after="80" w:line="240" w:lineRule="auto"/>
-        <w:rPr>
-          <w:rFonts w:ascii="Courier New" w:hAnsi="Courier New" w:cs="Courier New"/>
-          <w:sz w:val="20"/>
-        </w:rPr>
-      </w:pPr>
-      <w:r>
-        <w:rPr>
-          <w:rFonts w:ascii="Courier New" w:hAnsi="Courier New" w:cs="Courier New"/>
-          <w:sz w:val="20"/>
-        </w:rPr>
-        <w:t>}</w:t>
+        <w:t>Endpoint lấy danh sách tiếp đón được định nghĩa trong TiepDonController.cs. API cụ thể là HttpGet 'api/TiepDon/danh-sach' thực hiện phân trang, lọc theo ngày, trạng thái khám và bác sĩ:</w:t>
+      </w:r>
+    </w:p>
+    <w:p>
+      <w:pPr>
+        <w:spacing w:before="80" w:after="80" w:line="240" w:lineRule="auto"/>
+        <w:rPr>
+          <w:rFonts w:ascii="Courier New" w:hAnsi="Courier New" w:cs="Courier New"/>
+          <w:sz w:val="19"/>
+        </w:rPr>
+      </w:pPr>
+      <w:r>
+        <w:rPr>
+          <w:rFonts w:ascii="Courier New" w:hAnsi="Courier New" w:cs="Courier New"/>
+          <w:sz w:val="19"/>
+        </w:rPr>
+        <w:t xml:space="preserve">    [HttpGet("danh-sach")]</w:t>
+      </w:r>
+    </w:p>
+    <w:p>
+      <w:pPr>
+        <w:spacing w:before="80" w:after="80" w:line="240" w:lineRule="auto"/>
+        <w:rPr>
+          <w:rFonts w:ascii="Courier New" w:hAnsi="Courier New" w:cs="Courier New"/>
+          <w:sz w:val="19"/>
+        </w:rPr>
+      </w:pPr>
+      <w:r>
+        <w:rPr>
+          <w:rFonts w:ascii="Courier New" w:hAnsi="Courier New" w:cs="Courier New"/>
+          <w:sz w:val="19"/>
+        </w:rPr>
+        <w:t xml:space="preserve">    [Authorize(Roles = "LeTan,BacSi,Admin")]</w:t>
+      </w:r>
+    </w:p>
+    <w:p>
+      <w:pPr>
+        <w:spacing w:before="80" w:after="80" w:line="240" w:lineRule="auto"/>
+        <w:rPr>
+          <w:rFonts w:ascii="Courier New" w:hAnsi="Courier New" w:cs="Courier New"/>
+          <w:sz w:val="19"/>
+        </w:rPr>
+      </w:pPr>
+      <w:r>
+        <w:rPr>
+          <w:rFonts w:ascii="Courier New" w:hAnsi="Courier New" w:cs="Courier New"/>
+          <w:sz w:val="19"/>
+        </w:rPr>
+        <w:t xml:space="preserve">    public async Task&lt;IActionResult&gt; LayDanhSachTiepDon(</w:t>
+      </w:r>
+    </w:p>
+    <w:p>
+      <w:pPr>
+        <w:spacing w:before="80" w:after="80" w:line="240" w:lineRule="auto"/>
+        <w:rPr>
+          <w:rFonts w:ascii="Courier New" w:hAnsi="Courier New" w:cs="Courier New"/>
+          <w:sz w:val="19"/>
+        </w:rPr>
+      </w:pPr>
+      <w:r>
+        <w:rPr>
+          <w:rFonts w:ascii="Courier New" w:hAnsi="Courier New" w:cs="Courier New"/>
+          <w:sz w:val="19"/>
+        </w:rPr>
+        <w:t xml:space="preserve">        [FromQuery] string? search = null,</w:t>
+      </w:r>
+    </w:p>
+    <w:p>
+      <w:pPr>
+        <w:spacing w:before="80" w:after="80" w:line="240" w:lineRule="auto"/>
+        <w:rPr>
+          <w:rFonts w:ascii="Courier New" w:hAnsi="Courier New" w:cs="Courier New"/>
+          <w:sz w:val="19"/>
+        </w:rPr>
+      </w:pPr>
+      <w:r>
+        <w:rPr>
+          <w:rFonts w:ascii="Courier New" w:hAnsi="Courier New" w:cs="Courier New"/>
+          <w:sz w:val="19"/>
+        </w:rPr>
+        <w:t xml:space="preserve">        [FromQuery] string? maBacSi = null,</w:t>
+      </w:r>
+    </w:p>
+    <w:p>
+      <w:pPr>
+        <w:spacing w:before="80" w:after="80" w:line="240" w:lineRule="auto"/>
+        <w:rPr>
+          <w:rFonts w:ascii="Courier New" w:hAnsi="Courier New" w:cs="Courier New"/>
+          <w:sz w:val="19"/>
+        </w:rPr>
+      </w:pPr>
+      <w:r>
+        <w:rPr>
+          <w:rFonts w:ascii="Courier New" w:hAnsi="Courier New" w:cs="Courier New"/>
+          <w:sz w:val="19"/>
+        </w:rPr>
+        <w:t xml:space="preserve">        [FromQuery] int? trangThai = null,</w:t>
+      </w:r>
+    </w:p>
+    <w:p>
+      <w:pPr>
+        <w:spacing w:before="80" w:after="80" w:line="240" w:lineRule="auto"/>
+        <w:rPr>
+          <w:rFonts w:ascii="Courier New" w:hAnsi="Courier New" w:cs="Courier New"/>
+          <w:sz w:val="19"/>
+        </w:rPr>
+      </w:pPr>
+      <w:r>
+        <w:rPr>
+          <w:rFonts w:ascii="Courier New" w:hAnsi="Courier New" w:cs="Courier New"/>
+          <w:sz w:val="19"/>
+        </w:rPr>
+        <w:t xml:space="preserve">        [FromQuery] string? ngayKham = null,</w:t>
+      </w:r>
+    </w:p>
+    <w:p>
+      <w:pPr>
+        <w:spacing w:before="80" w:after="80" w:line="240" w:lineRule="auto"/>
+        <w:rPr>
+          <w:rFonts w:ascii="Courier New" w:hAnsi="Courier New" w:cs="Courier New"/>
+          <w:sz w:val="19"/>
+        </w:rPr>
+      </w:pPr>
+      <w:r>
+        <w:rPr>
+          <w:rFonts w:ascii="Courier New" w:hAnsi="Courier New" w:cs="Courier New"/>
+          <w:sz w:val="19"/>
+        </w:rPr>
+        <w:t xml:space="preserve">        [FromQuery] int page = 1,</w:t>
+      </w:r>
+    </w:p>
+    <w:p>
+      <w:pPr>
+        <w:spacing w:before="80" w:after="80" w:line="240" w:lineRule="auto"/>
+        <w:rPr>
+          <w:rFonts w:ascii="Courier New" w:hAnsi="Courier New" w:cs="Courier New"/>
+          <w:sz w:val="19"/>
+        </w:rPr>
+      </w:pPr>
+      <w:r>
+        <w:rPr>
+          <w:rFonts w:ascii="Courier New" w:hAnsi="Courier New" w:cs="Courier New"/>
+          <w:sz w:val="19"/>
+        </w:rPr>
+        <w:t xml:space="preserve">        [FromQuery] int limit = 100)</w:t>
+      </w:r>
+    </w:p>
+    <w:p>
+      <w:pPr>
+        <w:spacing w:before="80" w:after="80" w:line="240" w:lineRule="auto"/>
+        <w:rPr>
+          <w:rFonts w:ascii="Courier New" w:hAnsi="Courier New" w:cs="Courier New"/>
+          <w:sz w:val="19"/>
+        </w:rPr>
+      </w:pPr>
+      <w:r>
+        <w:rPr>
+          <w:rFonts w:ascii="Courier New" w:hAnsi="Courier New" w:cs="Courier New"/>
+          <w:sz w:val="19"/>
+        </w:rPr>
+        <w:t xml:space="preserve">    {</w:t>
+      </w:r>
+    </w:p>
+    <w:p>
+      <w:pPr>
+        <w:spacing w:before="80" w:after="80" w:line="240" w:lineRule="auto"/>
+        <w:rPr>
+          <w:rFonts w:ascii="Courier New" w:hAnsi="Courier New" w:cs="Courier New"/>
+          <w:sz w:val="19"/>
+        </w:rPr>
+      </w:pPr>
+      <w:r>
+        <w:rPr>
+          <w:rFonts w:ascii="Courier New" w:hAnsi="Courier New" w:cs="Courier New"/>
+          <w:sz w:val="19"/>
+        </w:rPr>
+        <w:t xml:space="preserve">        // 1. Kiểm tra định dạng ngày khám YYYY-MM-DD</w:t>
+      </w:r>
+    </w:p>
+    <w:p>
+      <w:pPr>
+        <w:spacing w:before="80" w:after="80" w:line="240" w:lineRule="auto"/>
+        <w:rPr>
+          <w:rFonts w:ascii="Courier New" w:hAnsi="Courier New" w:cs="Courier New"/>
+          <w:sz w:val="19"/>
+        </w:rPr>
+      </w:pPr>
+      <w:r>
+        <w:rPr>
+          <w:rFonts w:ascii="Courier New" w:hAnsi="Courier New" w:cs="Courier New"/>
+          <w:sz w:val="19"/>
+        </w:rPr>
+        <w:t xml:space="preserve">        // 2. Xây dựng câu truy vấn IQueryable của bảng PhieuKham kết hợp Include(p =&gt; p.BenhNhan)</w:t>
+      </w:r>
+    </w:p>
+    <w:p>
+      <w:pPr>
+        <w:spacing w:before="80" w:after="80" w:line="240" w:lineRule="auto"/>
+        <w:rPr>
+          <w:rFonts w:ascii="Courier New" w:hAnsi="Courier New" w:cs="Courier New"/>
+          <w:sz w:val="19"/>
+        </w:rPr>
+      </w:pPr>
+      <w:r>
+        <w:rPr>
+          <w:rFonts w:ascii="Courier New" w:hAnsi="Courier New" w:cs="Courier New"/>
+          <w:sz w:val="19"/>
+        </w:rPr>
+        <w:t xml:space="preserve">        // 3. Thực hiện lọc dữ liệu theo điều kiện động truyền vào</w:t>
+      </w:r>
+    </w:p>
+    <w:p>
+      <w:pPr>
+        <w:spacing w:before="80" w:after="80" w:line="240" w:lineRule="auto"/>
+        <w:rPr>
+          <w:rFonts w:ascii="Courier New" w:hAnsi="Courier New" w:cs="Courier New"/>
+          <w:sz w:val="19"/>
+        </w:rPr>
+      </w:pPr>
+      <w:r>
+        <w:rPr>
+          <w:rFonts w:ascii="Courier New" w:hAnsi="Courier New" w:cs="Courier New"/>
+          <w:sz w:val="19"/>
+        </w:rPr>
+        <w:t xml:space="preserve">        // 4. Phân trang dữ liệu và trả về kết quả kèm Metadata</w:t>
+      </w:r>
+    </w:p>
+    <w:p>
+      <w:pPr>
+        <w:spacing w:before="80" w:after="80" w:line="240" w:lineRule="auto"/>
+        <w:rPr>
+          <w:rFonts w:ascii="Courier New" w:hAnsi="Courier New" w:cs="Courier New"/>
+          <w:sz w:val="19"/>
+        </w:rPr>
+      </w:pPr>
+      <w:r>
+        <w:rPr>
+          <w:rFonts w:ascii="Courier New" w:hAnsi="Courier New" w:cs="Courier New"/>
+          <w:sz w:val="19"/>
+        </w:rPr>
+        <w:t xml:space="preserve">    }</w:t>
       </w:r>
     </w:p>
     <w:p>
@@ -591,7 +590,7 @@
           <w:b/>
           <w:sz w:val="28"/>
         </w:rPr>
-        <w:t>4. PHAN TICH MA NGUON FRONTEND (REACTJS &amp; TAILWIND CSS)</w:t>
+        <w:t>4. PHÂN TÍCH MÃ NGUỒN FRONTEND (REACTJS &amp; TAILWIND CSS)</w:t>
       </w:r>
     </w:p>
     <w:p>
@@ -609,7 +608,7 @@
           <w:b/>
           <w:sz w:val="26"/>
         </w:rPr>
-        <w:t>4.1. Ham goi API trong api.js</w:t>
+        <w:t>4.1. Hàm gọi API trong file utils/api.js</w:t>
       </w:r>
     </w:p>
     <w:p>
@@ -626,165 +625,165 @@
           <w:rFonts w:ascii="Times New Roman" w:hAnsi="Times New Roman" w:cs="Times New Roman"/>
           <w:sz w:val="26"/>
         </w:rPr>
-        <w:t>Frontend thuc hien ket noi thong qua ham apiGetDanhSachTiepNhan duoc khai bao nhu sau:</w:t>
-      </w:r>
-    </w:p>
-    <w:p>
-      <w:pPr>
-        <w:spacing w:after="80" w:line="240" w:lineRule="auto"/>
-        <w:rPr>
-          <w:rFonts w:ascii="Courier New" w:hAnsi="Courier New" w:cs="Courier New"/>
-          <w:sz w:val="20"/>
-        </w:rPr>
-      </w:pPr>
-      <w:r>
-        <w:rPr>
-          <w:rFonts w:ascii="Courier New" w:hAnsi="Courier New" w:cs="Courier New"/>
-          <w:sz w:val="20"/>
-        </w:rPr>
-        <w:t>export const apiGetDanhSachTiepNhan = async ({ search = `, maNV = `, trangThai = `, ngayKham = `, page = 1, limit = 50 } = {}) =&gt; {</w:t>
-      </w:r>
-    </w:p>
-    <w:p>
-      <w:pPr>
-        <w:spacing w:after="80" w:line="240" w:lineRule="auto"/>
-        <w:rPr>
-          <w:rFonts w:ascii="Courier New" w:hAnsi="Courier New" w:cs="Courier New"/>
-          <w:sz w:val="20"/>
-        </w:rPr>
-      </w:pPr>
-      <w:r>
-        <w:rPr>
-          <w:rFonts w:ascii="Courier New" w:hAnsi="Courier New" w:cs="Courier New"/>
-          <w:sz w:val="20"/>
+        <w:t>Frontend kết nối thông qua hàm apiGetDanhSachTiepNhan được khai báo như sau:</w:t>
+      </w:r>
+    </w:p>
+    <w:p>
+      <w:pPr>
+        <w:spacing w:before="80" w:after="80" w:line="240" w:lineRule="auto"/>
+        <w:rPr>
+          <w:rFonts w:ascii="Courier New" w:hAnsi="Courier New" w:cs="Courier New"/>
+          <w:sz w:val="19"/>
+        </w:rPr>
+      </w:pPr>
+      <w:r>
+        <w:rPr>
+          <w:rFonts w:ascii="Courier New" w:hAnsi="Courier New" w:cs="Courier New"/>
+          <w:sz w:val="19"/>
+        </w:rPr>
+        <w:t>export const apiGetDanhSachTiepNhan = async ({ search = "", maNV = "", trangThai = "", ngayKham = "", page = 1, limit = 50 } = {}) =&gt; {</w:t>
+      </w:r>
+    </w:p>
+    <w:p>
+      <w:pPr>
+        <w:spacing w:before="80" w:after="80" w:line="240" w:lineRule="auto"/>
+        <w:rPr>
+          <w:rFonts w:ascii="Courier New" w:hAnsi="Courier New" w:cs="Courier New"/>
+          <w:sz w:val="19"/>
+        </w:rPr>
+      </w:pPr>
+      <w:r>
+        <w:rPr>
+          <w:rFonts w:ascii="Courier New" w:hAnsi="Courier New" w:cs="Courier New"/>
+          <w:sz w:val="19"/>
         </w:rPr>
         <w:t xml:space="preserve">  const queryParams = new URLSearchParams();</w:t>
       </w:r>
     </w:p>
     <w:p>
       <w:pPr>
-        <w:spacing w:after="80" w:line="240" w:lineRule="auto"/>
-        <w:rPr>
-          <w:rFonts w:ascii="Courier New" w:hAnsi="Courier New" w:cs="Courier New"/>
-          <w:sz w:val="20"/>
-        </w:rPr>
-      </w:pPr>
-      <w:r>
-        <w:rPr>
-          <w:rFonts w:ascii="Courier New" w:hAnsi="Courier New" w:cs="Courier New"/>
-          <w:sz w:val="20"/>
+        <w:spacing w:before="80" w:after="80" w:line="240" w:lineRule="auto"/>
+        <w:rPr>
+          <w:rFonts w:ascii="Courier New" w:hAnsi="Courier New" w:cs="Courier New"/>
+          <w:sz w:val="19"/>
+        </w:rPr>
+      </w:pPr>
+      <w:r>
+        <w:rPr>
+          <w:rFonts w:ascii="Courier New" w:hAnsi="Courier New" w:cs="Courier New"/>
+          <w:sz w:val="19"/>
         </w:rPr>
         <w:t xml:space="preserve">  if (search) queryParams.append('search', search);</w:t>
       </w:r>
     </w:p>
     <w:p>
       <w:pPr>
-        <w:spacing w:after="80" w:line="240" w:lineRule="auto"/>
-        <w:rPr>
-          <w:rFonts w:ascii="Courier New" w:hAnsi="Courier New" w:cs="Courier New"/>
-          <w:sz w:val="20"/>
-        </w:rPr>
-      </w:pPr>
-      <w:r>
-        <w:rPr>
-          <w:rFonts w:ascii="Courier New" w:hAnsi="Courier New" w:cs="Courier New"/>
-          <w:sz w:val="20"/>
+        <w:spacing w:before="80" w:after="80" w:line="240" w:lineRule="auto"/>
+        <w:rPr>
+          <w:rFonts w:ascii="Courier New" w:hAnsi="Courier New" w:cs="Courier New"/>
+          <w:sz w:val="19"/>
+        </w:rPr>
+      </w:pPr>
+      <w:r>
+        <w:rPr>
+          <w:rFonts w:ascii="Courier New" w:hAnsi="Courier New" w:cs="Courier New"/>
+          <w:sz w:val="19"/>
         </w:rPr>
         <w:t xml:space="preserve">  if (maNV) queryParams.append('maBacSi', maNV);</w:t>
       </w:r>
     </w:p>
     <w:p>
       <w:pPr>
-        <w:spacing w:after="80" w:line="240" w:lineRule="auto"/>
-        <w:rPr>
-          <w:rFonts w:ascii="Courier New" w:hAnsi="Courier New" w:cs="Courier New"/>
-          <w:sz w:val="20"/>
-        </w:rPr>
-      </w:pPr>
-      <w:r>
-        <w:rPr>
-          <w:rFonts w:ascii="Courier New" w:hAnsi="Courier New" w:cs="Courier New"/>
-          <w:sz w:val="20"/>
+        <w:spacing w:before="80" w:after="80" w:line="240" w:lineRule="auto"/>
+        <w:rPr>
+          <w:rFonts w:ascii="Courier New" w:hAnsi="Courier New" w:cs="Courier New"/>
+          <w:sz w:val="19"/>
+        </w:rPr>
+      </w:pPr>
+      <w:r>
+        <w:rPr>
+          <w:rFonts w:ascii="Courier New" w:hAnsi="Courier New" w:cs="Courier New"/>
+          <w:sz w:val="19"/>
         </w:rPr>
         <w:t xml:space="preserve">  if (trangThai !== '' &amp;&amp; trangThai !== null) queryParams.append('trangThai', trangThai);</w:t>
       </w:r>
     </w:p>
     <w:p>
       <w:pPr>
-        <w:spacing w:after="80" w:line="240" w:lineRule="auto"/>
-        <w:rPr>
-          <w:rFonts w:ascii="Courier New" w:hAnsi="Courier New" w:cs="Courier New"/>
-          <w:sz w:val="20"/>
-        </w:rPr>
-      </w:pPr>
-      <w:r>
-        <w:rPr>
-          <w:rFonts w:ascii="Courier New" w:hAnsi="Courier New" w:cs="Courier New"/>
-          <w:sz w:val="20"/>
+        <w:spacing w:before="80" w:after="80" w:line="240" w:lineRule="auto"/>
+        <w:rPr>
+          <w:rFonts w:ascii="Courier New" w:hAnsi="Courier New" w:cs="Courier New"/>
+          <w:sz w:val="19"/>
+        </w:rPr>
+      </w:pPr>
+      <w:r>
+        <w:rPr>
+          <w:rFonts w:ascii="Courier New" w:hAnsi="Courier New" w:cs="Courier New"/>
+          <w:sz w:val="19"/>
         </w:rPr>
         <w:t xml:space="preserve">  if (ngayKham) queryParams.append('ngayKham', ngayKham);</w:t>
       </w:r>
     </w:p>
     <w:p>
       <w:pPr>
-        <w:spacing w:after="80" w:line="240" w:lineRule="auto"/>
-        <w:rPr>
-          <w:rFonts w:ascii="Courier New" w:hAnsi="Courier New" w:cs="Courier New"/>
-          <w:sz w:val="20"/>
-        </w:rPr>
-      </w:pPr>
-      <w:r>
-        <w:rPr>
-          <w:rFonts w:ascii="Courier New" w:hAnsi="Courier New" w:cs="Courier New"/>
-          <w:sz w:val="20"/>
+        <w:spacing w:before="80" w:after="80" w:line="240" w:lineRule="auto"/>
+        <w:rPr>
+          <w:rFonts w:ascii="Courier New" w:hAnsi="Courier New" w:cs="Courier New"/>
+          <w:sz w:val="19"/>
+        </w:rPr>
+      </w:pPr>
+      <w:r>
+        <w:rPr>
+          <w:rFonts w:ascii="Courier New" w:hAnsi="Courier New" w:cs="Courier New"/>
+          <w:sz w:val="19"/>
         </w:rPr>
         <w:t xml:space="preserve">  queryParams.append('page', page);</w:t>
       </w:r>
     </w:p>
     <w:p>
       <w:pPr>
-        <w:spacing w:after="80" w:line="240" w:lineRule="auto"/>
-        <w:rPr>
-          <w:rFonts w:ascii="Courier New" w:hAnsi="Courier New" w:cs="Courier New"/>
-          <w:sz w:val="20"/>
-        </w:rPr>
-      </w:pPr>
-      <w:r>
-        <w:rPr>
-          <w:rFonts w:ascii="Courier New" w:hAnsi="Courier New" w:cs="Courier New"/>
-          <w:sz w:val="20"/>
+        <w:spacing w:before="80" w:after="80" w:line="240" w:lineRule="auto"/>
+        <w:rPr>
+          <w:rFonts w:ascii="Courier New" w:hAnsi="Courier New" w:cs="Courier New"/>
+          <w:sz w:val="19"/>
+        </w:rPr>
+      </w:pPr>
+      <w:r>
+        <w:rPr>
+          <w:rFonts w:ascii="Courier New" w:hAnsi="Courier New" w:cs="Courier New"/>
+          <w:sz w:val="19"/>
         </w:rPr>
         <w:t xml:space="preserve">  queryParams.append('limit', limit);</w:t>
       </w:r>
     </w:p>
     <w:p>
       <w:pPr>
-        <w:spacing w:after="80" w:line="240" w:lineRule="auto"/>
-        <w:rPr>
-          <w:rFonts w:ascii="Courier New" w:hAnsi="Courier New" w:cs="Courier New"/>
-          <w:sz w:val="20"/>
-        </w:rPr>
-      </w:pPr>
-      <w:r>
-        <w:rPr>
-          <w:rFonts w:ascii="Courier New" w:hAnsi="Courier New" w:cs="Courier New"/>
-          <w:sz w:val="20"/>
-        </w:rPr>
-        <w:t xml:space="preserve">  return await apiFetch(/TiepDon/danh-sach? + queryParams.toString());</w:t>
-      </w:r>
-    </w:p>
-    <w:p>
-      <w:pPr>
-        <w:spacing w:after="80" w:line="240" w:lineRule="auto"/>
-        <w:rPr>
-          <w:rFonts w:ascii="Courier New" w:hAnsi="Courier New" w:cs="Courier New"/>
-          <w:sz w:val="20"/>
-        </w:rPr>
-      </w:pPr>
-      <w:r>
-        <w:rPr>
-          <w:rFonts w:ascii="Courier New" w:hAnsi="Courier New" w:cs="Courier New"/>
-          <w:sz w:val="20"/>
+        <w:spacing w:before="80" w:after="80" w:line="240" w:lineRule="auto"/>
+        <w:rPr>
+          <w:rFonts w:ascii="Courier New" w:hAnsi="Courier New" w:cs="Courier New"/>
+          <w:sz w:val="19"/>
+        </w:rPr>
+      </w:pPr>
+      <w:r>
+        <w:rPr>
+          <w:rFonts w:ascii="Courier New" w:hAnsi="Courier New" w:cs="Courier New"/>
+          <w:sz w:val="19"/>
+        </w:rPr>
+        <w:t xml:space="preserve">  return await apiFetch(`/TiepDon/danh-sach?` + queryParams.toString());</w:t>
+      </w:r>
+    </w:p>
+    <w:p>
+      <w:pPr>
+        <w:spacing w:before="80" w:after="80" w:line="240" w:lineRule="auto"/>
+        <w:rPr>
+          <w:rFonts w:ascii="Courier New" w:hAnsi="Courier New" w:cs="Courier New"/>
+          <w:sz w:val="19"/>
+        </w:rPr>
+      </w:pPr>
+      <w:r>
+        <w:rPr>
+          <w:rFonts w:ascii="Courier New" w:hAnsi="Courier New" w:cs="Courier New"/>
+          <w:sz w:val="19"/>
         </w:rPr>
         <w:t>};</w:t>
       </w:r>
@@ -821,103 +820,7 @@
           <w:rFonts w:ascii="Times New Roman" w:hAnsi="Times New Roman" w:cs="Times New Roman"/>
           <w:sz w:val="26"/>
         </w:rPr>
-        <w:t>Trang hien thi danh sach tiep don su dung React Hooks de tu dong tai lai du lieu moi khi nguon bo loc thay doi:</w:t>
-      </w:r>
-    </w:p>
-    <w:p>
-      <w:pPr>
-        <w:spacing w:after="80" w:line="240" w:lineRule="auto"/>
-        <w:jc w:val="both"/>
-        <w:rPr>
-          <w:rFonts w:ascii="Times New Roman" w:hAnsi="Times New Roman" w:cs="Times New Roman"/>
-          <w:sz w:val="26"/>
-        </w:rPr>
-      </w:pPr>
-      <w:r>
-        <w:rPr>
-          <w:rFonts w:ascii="Times New Roman" w:hAnsi="Times New Roman" w:cs="Times New Roman"/>
-          <w:sz w:val="26"/>
-        </w:rPr>
-        <w:t xml:space="preserve">   *   </w:t>
-      </w:r>
-      <w:r>
-        <w:rPr>
-          <w:rFonts w:ascii="Times New Roman" w:hAnsi="Times New Roman" w:cs="Times New Roman"/>
-          <w:b/>
-          <w:sz w:val="26"/>
-        </w:rPr>
-        <w:t xml:space="preserve">useEffect tu dong load: </w:t>
-      </w:r>
-      <w:r>
-        <w:rPr>
-          <w:rFonts w:ascii="Times New Roman" w:hAnsi="Times New Roman" w:cs="Times New Roman"/>
-          <w:sz w:val="26"/>
-        </w:rPr>
-        <w:t>Khi searchQuery, selectedDoctor, selectedStatus, hoac selectedDate thay doi, React se tu dong kich hoat goi lai API fetchDanhSachTiepNhan de cap nhat danh sach phieu kham moi nhat.</w:t>
-      </w:r>
-    </w:p>
-    <w:p>
-      <w:pPr>
-        <w:spacing w:after="80" w:line="240" w:lineRule="auto"/>
-        <w:jc w:val="both"/>
-        <w:rPr>
-          <w:rFonts w:ascii="Times New Roman" w:hAnsi="Times New Roman" w:cs="Times New Roman"/>
-          <w:sz w:val="26"/>
-        </w:rPr>
-      </w:pPr>
-      <w:r>
-        <w:rPr>
-          <w:rFonts w:ascii="Times New Roman" w:hAnsi="Times New Roman" w:cs="Times New Roman"/>
-          <w:sz w:val="26"/>
-        </w:rPr>
-        <w:t xml:space="preserve">   *   </w:t>
-      </w:r>
-      <w:r>
-        <w:rPr>
-          <w:rFonts w:ascii="Times New Roman" w:hAnsi="Times New Roman" w:cs="Times New Roman"/>
-          <w:b/>
-          <w:sz w:val="26"/>
-        </w:rPr>
-        <w:t xml:space="preserve">Tailwind CSS lam dep: </w:t>
-      </w:r>
-      <w:r>
-        <w:rPr>
-          <w:rFonts w:ascii="Times New Roman" w:hAnsi="Times New Roman" w:cs="Times New Roman"/>
-          <w:sz w:val="26"/>
-        </w:rPr>
-        <w:t>Su dung grid layouts de lam bang bo loc thang hang va responsive. Tich hop cac class Tailwind h-10 py-1.5 cho input va select de thiet ke rong rai hon.</w:t>
-      </w:r>
-    </w:p>
-    <w:p>
-      <w:pPr>
-        <w:spacing w:after="80" w:line="240" w:lineRule="auto"/>
-        <w:jc w:val="both"/>
-        <w:rPr>
-          <w:rFonts w:ascii="Times New Roman" w:hAnsi="Times New Roman" w:cs="Times New Roman"/>
-          <w:sz w:val="26"/>
-        </w:rPr>
-      </w:pPr>
-      <w:r>
-        <w:rPr>
-          <w:rFonts w:ascii="Times New Roman" w:hAnsi="Times New Roman" w:cs="Times New Roman"/>
-          <w:sz w:val="26"/>
-        </w:rPr>
-        <w:t xml:space="preserve">   *   </w:t>
-      </w:r>
-      <w:r>
-        <w:rPr>
-          <w:rFonts w:ascii="Times New Roman" w:hAnsi="Times New Roman" w:cs="Times New Roman"/>
-          <w:b/>
-          <w:sz w:val="26"/>
-        </w:rPr>
-        <w:t xml:space="preserve">Anh xa khoa phong bac si: </w:t>
-      </w:r>
-      <w:r>
-        <w:rPr>
-          <w:rFonts w:ascii="Times New Roman" w:hAnsi="Times New Roman" w:cs="Times New Roman"/>
-          <w:sz w:val="26"/>
-        </w:rPr>
-        <w:t>Tich hop goi apiGetKhoaList de lay ten khoa phong dang lam viec hien thi ben canh ho ten bac si (vi du: Mai Xuan Phuc - Khoa Noi).</w:t>
+        <w:t>Trang hiển thị danh sách tiếp đón sử dụng Hook useEffect tự động gọi lại API cập nhật dữ liệu mỗi khi người dùng thay đổi bộ lọc (ngày khám, bác sĩ hoặc trạng thái). Sử dụng các tiện ích CSS của Tailwind để căn chỉnh bảng bộ lọc cân đối và responsive trên thiết bị di động.</w:t>
       </w:r>
     </w:p>
     <w:p>
@@ -935,7 +838,7 @@
           <w:b/>
           <w:sz w:val="28"/>
         </w:rPr>
-        <w:t>5. CAC CAU HOI BAO VE LUAN VAN</w:t>
+        <w:t>5. CÁC CÀU HỎI THƯỜNG GẶP KHI BẢO VỆ LUẬN VĂN</w:t>
       </w:r>
     </w:p>
     <w:p>
@@ -953,7 +856,7 @@
           <w:b/>
           <w:sz w:val="26"/>
         </w:rPr>
-        <w:t>Cau hoi 1: Tai sao lai phai truyen maNV vao tham so maBacSi trong API?</w:t>
+        <w:t>Câu hỏi 1: Tại sao lại phải truyền maNV vào tham số maBacSi trong API?</w:t>
       </w:r>
     </w:p>
     <w:p>
@@ -970,7 +873,7 @@
           <w:rFonts w:ascii="Times New Roman" w:hAnsi="Times New Roman" w:cs="Times New Roman"/>
           <w:sz w:val="26"/>
         </w:rPr>
-        <w:t>Tra loi: Vi tren co so du lieu va thiet ke thuc the he thong, Bac si thuc chat cung la mot Nhan vien (NhanVien). Do do, khoa chinh luu trong bang NhanVien la MaNV duoc dung de lien ket voi truong MaBacSiChiDinh tren phieu kham.</w:t>
+        <w:t>Trả lời: Vì trên cơ sở dữ liệu và thiết kế các thực thể (Entities), Bác sĩ thực chất cũng là một nhân sự thuộc bảng NhanVien. Do đó, khóa chính duy nhất lưu trong bảng NhanVien là MaNV được sử dụng để liên kết trực tiếp với trường MaBacSiChiDinh trên phiếu khám bệnh.</w:t>
       </w:r>
     </w:p>
     <w:p>
@@ -988,7 +891,7 @@
           <w:b/>
           <w:sz w:val="26"/>
         </w:rPr>
-        <w:t>Cau hoi 2: Giao dien su dung phuong phap nao de tranh tai lai toan bo trang?</w:t>
+        <w:t>Câu hỏi 2: Giao diện sử dụng phương pháp nào để tránh tải lại toàn bộ trang?</w:t>
       </w:r>
     </w:p>
     <w:p>
@@ -1005,7 +908,7 @@
           <w:rFonts w:ascii="Times New Roman" w:hAnsi="Times New Roman" w:cs="Times New Roman"/>
           <w:sz w:val="26"/>
         </w:rPr>
-        <w:t>Tra loi: Ung dung su dung Single Page Application (SPA) voi React-Router-Dom de chuyen huong nhanh chong ma khong reload trinh duyet. Viec lay du lieu duoc thuc hien bat dong bo qua Fetch API va luu tru trong React State, giup trang web phan hoi tuc thi voi nguoi dung.</w:t>
+        <w:t>Trả lời: Ứng dụng sử dụng kiến trúc Single Page Application (SPA) với thư viện React-Router-Dom để điều hướng nhanh mà không cần tải lại trình duyệt. Việc lấy dữ liệu được thực hiện bất đồng bộ (Asynchronous) qua Fetch API giúp phản hồi nhanh chóng, nâng cao trải nghiệm người dùng.</w:t>
       </w:r>
     </w:p>
     <w:p>
@@ -1436,7 +1339,7 @@
     <w:link w:val="Heading1Char"/>
     <w:uiPriority w:val="9"/>
     <w:qFormat/>
-    <w:rsid w:val="00943F4B"/>
+    <w:rsid w:val="006C554B"/>
     <w:pPr>
       <w:keepNext/>
       <w:keepLines/>
@@ -1459,7 +1362,7 @@
     <w:semiHidden/>
     <w:unhideWhenUsed/>
     <w:qFormat/>
-    <w:rsid w:val="00943F4B"/>
+    <w:rsid w:val="006C554B"/>
     <w:pPr>
       <w:keepNext/>
       <w:keepLines/>
@@ -1482,7 +1385,7 @@
     <w:semiHidden/>
     <w:unhideWhenUsed/>
     <w:qFormat/>
-    <w:rsid w:val="00943F4B"/>
+    <w:rsid w:val="006C554B"/>
     <w:pPr>
       <w:keepNext/>
       <w:keepLines/>
@@ -1505,7 +1408,7 @@
     <w:semiHidden/>
     <w:unhideWhenUsed/>
     <w:qFormat/>
-    <w:rsid w:val="00943F4B"/>
+    <w:rsid w:val="006C554B"/>
     <w:pPr>
       <w:keepNext/>
       <w:keepLines/>
@@ -1528,7 +1431,7 @@
     <w:semiHidden/>
     <w:unhideWhenUsed/>
     <w:qFormat/>
-    <w:rsid w:val="00943F4B"/>
+    <w:rsid w:val="006C554B"/>
     <w:pPr>
       <w:keepNext/>
       <w:keepLines/>
@@ -1549,7 +1452,7 @@
     <w:semiHidden/>
     <w:unhideWhenUsed/>
     <w:qFormat/>
-    <w:rsid w:val="00943F4B"/>
+    <w:rsid w:val="006C554B"/>
     <w:pPr>
       <w:keepNext/>
       <w:keepLines/>
@@ -1572,7 +1475,7 @@
     <w:semiHidden/>
     <w:unhideWhenUsed/>
     <w:qFormat/>
-    <w:rsid w:val="00943F4B"/>
+    <w:rsid w:val="006C554B"/>
     <w:pPr>
       <w:keepNext/>
       <w:keepLines/>
@@ -1593,7 +1496,7 @@
     <w:semiHidden/>
     <w:unhideWhenUsed/>
     <w:qFormat/>
-    <w:rsid w:val="00943F4B"/>
+    <w:rsid w:val="006C554B"/>
     <w:pPr>
       <w:keepNext/>
       <w:keepLines/>
@@ -1616,7 +1519,7 @@
     <w:semiHidden/>
     <w:unhideWhenUsed/>
     <w:qFormat/>
-    <w:rsid w:val="00943F4B"/>
+    <w:rsid w:val="006C554B"/>
     <w:pPr>
       <w:keepNext/>
       <w:keepLines/>
@@ -1660,7 +1563,7 @@
     <w:basedOn w:val="DefaultParagraphFont"/>
     <w:link w:val="Heading1"/>
     <w:uiPriority w:val="9"/>
-    <w:rsid w:val="00943F4B"/>
+    <w:rsid w:val="006C554B"/>
     <w:rPr>
       <w:rFonts w:asciiTheme="majorHAnsi" w:eastAsiaTheme="majorEastAsia" w:hAnsiTheme="majorHAnsi" w:cstheme="majorBidi"/>
       <w:color w:val="0F4761" w:themeColor="accent1" w:themeShade="BF"/>
@@ -1674,7 +1577,7 @@
     <w:link w:val="Heading2"/>
     <w:uiPriority w:val="9"/>
     <w:semiHidden/>
-    <w:rsid w:val="00943F4B"/>
+    <w:rsid w:val="006C554B"/>
     <w:rPr>
       <w:rFonts w:asciiTheme="majorHAnsi" w:eastAsiaTheme="majorEastAsia" w:hAnsiTheme="majorHAnsi" w:cstheme="majorBidi"/>
       <w:color w:val="0F4761" w:themeColor="accent1" w:themeShade="BF"/>
@@ -1688,7 +1591,7 @@
     <w:link w:val="Heading3"/>
     <w:uiPriority w:val="9"/>
     <w:semiHidden/>
-    <w:rsid w:val="00943F4B"/>
+    <w:rsid w:val="006C554B"/>
     <w:rPr>
       <w:rFonts w:eastAsiaTheme="majorEastAsia" w:cstheme="majorBidi"/>
       <w:color w:val="0F4761" w:themeColor="accent1" w:themeShade="BF"/>
@@ -1702,7 +1605,7 @@
     <w:link w:val="Heading4"/>
     <w:uiPriority w:val="9"/>
     <w:semiHidden/>
-    <w:rsid w:val="00943F4B"/>
+    <w:rsid w:val="006C554B"/>
     <w:rPr>
       <w:rFonts w:eastAsiaTheme="majorEastAsia" w:cstheme="majorBidi"/>
       <w:i/>
@@ -1716,7 +1619,7 @@
     <w:link w:val="Heading5"/>
     <w:uiPriority w:val="9"/>
     <w:semiHidden/>
-    <w:rsid w:val="00943F4B"/>
+    <w:rsid w:val="006C554B"/>
     <w:rPr>
       <w:rFonts w:eastAsiaTheme="majorEastAsia" w:cstheme="majorBidi"/>
       <w:color w:val="0F4761" w:themeColor="accent1" w:themeShade="BF"/>
@@ -1728,7 +1631,7 @@
     <w:link w:val="Heading6"/>
     <w:uiPriority w:val="9"/>
     <w:semiHidden/>
-    <w:rsid w:val="00943F4B"/>
+    <w:rsid w:val="006C554B"/>
     <w:rPr>
       <w:rFonts w:eastAsiaTheme="majorEastAsia" w:cstheme="majorBidi"/>
       <w:i/>
@@ -1742,7 +1645,7 @@
     <w:link w:val="Heading7"/>
     <w:uiPriority w:val="9"/>
     <w:semiHidden/>
-    <w:rsid w:val="00943F4B"/>
+    <w:rsid w:val="006C554B"/>
     <w:rPr>
       <w:rFonts w:eastAsiaTheme="majorEastAsia" w:cstheme="majorBidi"/>
       <w:color w:val="595959" w:themeColor="text1" w:themeTint="A6"/>
@@ -1754,7 +1657,7 @@
     <w:link w:val="Heading8"/>
     <w:uiPriority w:val="9"/>
     <w:semiHidden/>
-    <w:rsid w:val="00943F4B"/>
+    <w:rsid w:val="006C554B"/>
     <w:rPr>
       <w:rFonts w:eastAsiaTheme="majorEastAsia" w:cstheme="majorBidi"/>
       <w:i/>
@@ -1768,7 +1671,7 @@
     <w:link w:val="Heading9"/>
     <w:uiPriority w:val="9"/>
     <w:semiHidden/>
-    <w:rsid w:val="00943F4B"/>
+    <w:rsid w:val="006C554B"/>
     <w:rPr>
       <w:rFonts w:eastAsiaTheme="majorEastAsia" w:cstheme="majorBidi"/>
       <w:color w:val="272727" w:themeColor="text1" w:themeTint="D8"/>
@@ -1781,7 +1684,7 @@
     <w:link w:val="TitleChar"/>
     <w:uiPriority w:val="10"/>
     <w:qFormat/>
-    <w:rsid w:val="00943F4B"/>
+    <w:rsid w:val="006C554B"/>
     <w:pPr>
       <w:spacing w:after="80" w:line="240" w:lineRule="auto"/>
       <w:contextualSpacing/>
@@ -1799,7 +1702,7 @@
     <w:basedOn w:val="DefaultParagraphFont"/>
     <w:link w:val="Title"/>
     <w:uiPriority w:val="10"/>
-    <w:rsid w:val="00943F4B"/>
+    <w:rsid w:val="006C554B"/>
     <w:rPr>
       <w:rFonts w:asciiTheme="majorHAnsi" w:eastAsiaTheme="majorEastAsia" w:hAnsiTheme="majorHAnsi" w:cstheme="majorBidi"/>
       <w:spacing w:val="-10"/>
@@ -1815,7 +1718,7 @@
     <w:link w:val="SubtitleChar"/>
     <w:uiPriority w:val="11"/>
     <w:qFormat/>
-    <w:rsid w:val="00943F4B"/>
+    <w:rsid w:val="006C554B"/>
     <w:pPr>
       <w:numPr>
         <w:ilvl w:val="1"/>
@@ -1834,7 +1737,7 @@
     <w:basedOn w:val="DefaultParagraphFont"/>
     <w:link w:val="Subtitle"/>
     <w:uiPriority w:val="11"/>
-    <w:rsid w:val="00943F4B"/>
+    <w:rsid w:val="006C554B"/>
     <w:rPr>
       <w:rFonts w:eastAsiaTheme="majorEastAsia" w:cstheme="majorBidi"/>
       <w:color w:val="595959" w:themeColor="text1" w:themeTint="A6"/>
@@ -1850,7 +1753,7 @@
     <w:link w:val="QuoteChar"/>
     <w:uiPriority w:val="29"/>
     <w:qFormat/>
-    <w:rsid w:val="00943F4B"/>
+    <w:rsid w:val="006C554B"/>
     <w:pPr>
       <w:spacing w:before="160"/>
       <w:jc w:val="center"/>
@@ -1866,7 +1769,7 @@
     <w:basedOn w:val="DefaultParagraphFont"/>
     <w:link w:val="Quote"/>
     <w:uiPriority w:val="29"/>
-    <w:rsid w:val="00943F4B"/>
+    <w:rsid w:val="006C554B"/>
     <w:rPr>
       <w:i/>
       <w:iCs/>
@@ -1878,7 +1781,7 @@
     <w:basedOn w:val="Normal"/>
     <w:uiPriority w:val="34"/>
     <w:qFormat/>
-    <w:rsid w:val="00943F4B"/>
+    <w:rsid w:val="006C554B"/>
     <w:pPr>
       <w:ind w:left="720"/>
       <w:contextualSpacing/>
@@ -1889,7 +1792,7 @@
     <w:basedOn w:val="DefaultParagraphFont"/>
     <w:uiPriority w:val="21"/>
     <w:qFormat/>
-    <w:rsid w:val="00943F4B"/>
+    <w:rsid w:val="006C554B"/>
     <w:rPr>
       <w:i/>
       <w:iCs/>
@@ -1903,7 +1806,7 @@
     <w:link w:val="IntenseQuoteChar"/>
     <w:uiPriority w:val="30"/>
     <w:qFormat/>
-    <w:rsid w:val="00943F4B"/>
+    <w:rsid w:val="006C554B"/>
     <w:pPr>
       <w:pBdr>
         <w:top w:val="single" w:sz="4" w:space="10" w:color="0F4761" w:themeColor="accent1" w:themeShade="BF"/>
@@ -1924,7 +1827,7 @@
     <w:basedOn w:val="DefaultParagraphFont"/>
     <w:link w:val="IntenseQuote"/>
     <w:uiPriority w:val="30"/>
-    <w:rsid w:val="00943F4B"/>
+    <w:rsid w:val="006C554B"/>
     <w:rPr>
       <w:i/>
       <w:iCs/>
@@ -1936,7 +1839,7 @@
     <w:basedOn w:val="DefaultParagraphFont"/>
     <w:uiPriority w:val="32"/>
     <w:qFormat/>
-    <w:rsid w:val="00943F4B"/>
+    <w:rsid w:val="006C554B"/>
     <w:rPr>
       <w:b/>
       <w:bCs/>

</xml_diff>

<commit_message>
thay đổi giao diện khám bệnh
</commit_message>
<xml_diff>
--- a/DanhSachTiepNhan.docx
+++ b/DanhSachTiepNhan.docx
@@ -820,7 +820,7 @@
           <w:rFonts w:ascii="Times New Roman" w:hAnsi="Times New Roman" w:cs="Times New Roman"/>
           <w:sz w:val="26"/>
         </w:rPr>
-        <w:t>Trang hiển thị danh sách tiếp đón sử dụng Hook useEffect tự động gọi lại API cập nhật dữ liệu mỗi khi người dùng thay đổi bộ lọc (ngày khám, bác sĩ hoặc trạng thái). Sử dụng các tiện ích CSS của Tailwind để căn chỉnh bảng bộ lọc cân đối và responsive trên thiết bị di động.</w:t>
+        <w:t>Trang hiển thị danh sách tiếp đón sử dụng các Hook useState, useEffect để quản lý bộ lọc khoảng thời gian (Từ ngày, Đến ngày). Khi thay đổi khoảng thời gian hoặc các tiêu chí lọc khác (bác sĩ, trạng thái), hệ thống tự động tính toán số ngày trong khoảng và gọi đồng thời các yêu cầu API (qua Promise.all) để gộp và sắp xếp kết quả hiển thị động mà không cần tác động sửa đổi mã nguồn Backend của phòng khám.</w:t>
       </w:r>
     </w:p>
     <w:p>
@@ -1339,7 +1339,7 @@
     <w:link w:val="Heading1Char"/>
     <w:uiPriority w:val="9"/>
     <w:qFormat/>
-    <w:rsid w:val="006C554B"/>
+    <w:rsid w:val="00A32097"/>
     <w:pPr>
       <w:keepNext/>
       <w:keepLines/>
@@ -1362,7 +1362,7 @@
     <w:semiHidden/>
     <w:unhideWhenUsed/>
     <w:qFormat/>
-    <w:rsid w:val="006C554B"/>
+    <w:rsid w:val="00A32097"/>
     <w:pPr>
       <w:keepNext/>
       <w:keepLines/>
@@ -1385,7 +1385,7 @@
     <w:semiHidden/>
     <w:unhideWhenUsed/>
     <w:qFormat/>
-    <w:rsid w:val="006C554B"/>
+    <w:rsid w:val="00A32097"/>
     <w:pPr>
       <w:keepNext/>
       <w:keepLines/>
@@ -1408,7 +1408,7 @@
     <w:semiHidden/>
     <w:unhideWhenUsed/>
     <w:qFormat/>
-    <w:rsid w:val="006C554B"/>
+    <w:rsid w:val="00A32097"/>
     <w:pPr>
       <w:keepNext/>
       <w:keepLines/>
@@ -1431,7 +1431,7 @@
     <w:semiHidden/>
     <w:unhideWhenUsed/>
     <w:qFormat/>
-    <w:rsid w:val="006C554B"/>
+    <w:rsid w:val="00A32097"/>
     <w:pPr>
       <w:keepNext/>
       <w:keepLines/>
@@ -1452,7 +1452,7 @@
     <w:semiHidden/>
     <w:unhideWhenUsed/>
     <w:qFormat/>
-    <w:rsid w:val="006C554B"/>
+    <w:rsid w:val="00A32097"/>
     <w:pPr>
       <w:keepNext/>
       <w:keepLines/>
@@ -1475,7 +1475,7 @@
     <w:semiHidden/>
     <w:unhideWhenUsed/>
     <w:qFormat/>
-    <w:rsid w:val="006C554B"/>
+    <w:rsid w:val="00A32097"/>
     <w:pPr>
       <w:keepNext/>
       <w:keepLines/>
@@ -1496,7 +1496,7 @@
     <w:semiHidden/>
     <w:unhideWhenUsed/>
     <w:qFormat/>
-    <w:rsid w:val="006C554B"/>
+    <w:rsid w:val="00A32097"/>
     <w:pPr>
       <w:keepNext/>
       <w:keepLines/>
@@ -1519,7 +1519,7 @@
     <w:semiHidden/>
     <w:unhideWhenUsed/>
     <w:qFormat/>
-    <w:rsid w:val="006C554B"/>
+    <w:rsid w:val="00A32097"/>
     <w:pPr>
       <w:keepNext/>
       <w:keepLines/>
@@ -1563,7 +1563,7 @@
     <w:basedOn w:val="DefaultParagraphFont"/>
     <w:link w:val="Heading1"/>
     <w:uiPriority w:val="9"/>
-    <w:rsid w:val="006C554B"/>
+    <w:rsid w:val="00A32097"/>
     <w:rPr>
       <w:rFonts w:asciiTheme="majorHAnsi" w:eastAsiaTheme="majorEastAsia" w:hAnsiTheme="majorHAnsi" w:cstheme="majorBidi"/>
       <w:color w:val="0F4761" w:themeColor="accent1" w:themeShade="BF"/>
@@ -1577,7 +1577,7 @@
     <w:link w:val="Heading2"/>
     <w:uiPriority w:val="9"/>
     <w:semiHidden/>
-    <w:rsid w:val="006C554B"/>
+    <w:rsid w:val="00A32097"/>
     <w:rPr>
       <w:rFonts w:asciiTheme="majorHAnsi" w:eastAsiaTheme="majorEastAsia" w:hAnsiTheme="majorHAnsi" w:cstheme="majorBidi"/>
       <w:color w:val="0F4761" w:themeColor="accent1" w:themeShade="BF"/>
@@ -1591,7 +1591,7 @@
     <w:link w:val="Heading3"/>
     <w:uiPriority w:val="9"/>
     <w:semiHidden/>
-    <w:rsid w:val="006C554B"/>
+    <w:rsid w:val="00A32097"/>
     <w:rPr>
       <w:rFonts w:eastAsiaTheme="majorEastAsia" w:cstheme="majorBidi"/>
       <w:color w:val="0F4761" w:themeColor="accent1" w:themeShade="BF"/>
@@ -1605,7 +1605,7 @@
     <w:link w:val="Heading4"/>
     <w:uiPriority w:val="9"/>
     <w:semiHidden/>
-    <w:rsid w:val="006C554B"/>
+    <w:rsid w:val="00A32097"/>
     <w:rPr>
       <w:rFonts w:eastAsiaTheme="majorEastAsia" w:cstheme="majorBidi"/>
       <w:i/>
@@ -1619,7 +1619,7 @@
     <w:link w:val="Heading5"/>
     <w:uiPriority w:val="9"/>
     <w:semiHidden/>
-    <w:rsid w:val="006C554B"/>
+    <w:rsid w:val="00A32097"/>
     <w:rPr>
       <w:rFonts w:eastAsiaTheme="majorEastAsia" w:cstheme="majorBidi"/>
       <w:color w:val="0F4761" w:themeColor="accent1" w:themeShade="BF"/>
@@ -1631,7 +1631,7 @@
     <w:link w:val="Heading6"/>
     <w:uiPriority w:val="9"/>
     <w:semiHidden/>
-    <w:rsid w:val="006C554B"/>
+    <w:rsid w:val="00A32097"/>
     <w:rPr>
       <w:rFonts w:eastAsiaTheme="majorEastAsia" w:cstheme="majorBidi"/>
       <w:i/>
@@ -1645,7 +1645,7 @@
     <w:link w:val="Heading7"/>
     <w:uiPriority w:val="9"/>
     <w:semiHidden/>
-    <w:rsid w:val="006C554B"/>
+    <w:rsid w:val="00A32097"/>
     <w:rPr>
       <w:rFonts w:eastAsiaTheme="majorEastAsia" w:cstheme="majorBidi"/>
       <w:color w:val="595959" w:themeColor="text1" w:themeTint="A6"/>
@@ -1657,7 +1657,7 @@
     <w:link w:val="Heading8"/>
     <w:uiPriority w:val="9"/>
     <w:semiHidden/>
-    <w:rsid w:val="006C554B"/>
+    <w:rsid w:val="00A32097"/>
     <w:rPr>
       <w:rFonts w:eastAsiaTheme="majorEastAsia" w:cstheme="majorBidi"/>
       <w:i/>
@@ -1671,7 +1671,7 @@
     <w:link w:val="Heading9"/>
     <w:uiPriority w:val="9"/>
     <w:semiHidden/>
-    <w:rsid w:val="006C554B"/>
+    <w:rsid w:val="00A32097"/>
     <w:rPr>
       <w:rFonts w:eastAsiaTheme="majorEastAsia" w:cstheme="majorBidi"/>
       <w:color w:val="272727" w:themeColor="text1" w:themeTint="D8"/>
@@ -1684,7 +1684,7 @@
     <w:link w:val="TitleChar"/>
     <w:uiPriority w:val="10"/>
     <w:qFormat/>
-    <w:rsid w:val="006C554B"/>
+    <w:rsid w:val="00A32097"/>
     <w:pPr>
       <w:spacing w:after="80" w:line="240" w:lineRule="auto"/>
       <w:contextualSpacing/>
@@ -1702,7 +1702,7 @@
     <w:basedOn w:val="DefaultParagraphFont"/>
     <w:link w:val="Title"/>
     <w:uiPriority w:val="10"/>
-    <w:rsid w:val="006C554B"/>
+    <w:rsid w:val="00A32097"/>
     <w:rPr>
       <w:rFonts w:asciiTheme="majorHAnsi" w:eastAsiaTheme="majorEastAsia" w:hAnsiTheme="majorHAnsi" w:cstheme="majorBidi"/>
       <w:spacing w:val="-10"/>
@@ -1718,7 +1718,7 @@
     <w:link w:val="SubtitleChar"/>
     <w:uiPriority w:val="11"/>
     <w:qFormat/>
-    <w:rsid w:val="006C554B"/>
+    <w:rsid w:val="00A32097"/>
     <w:pPr>
       <w:numPr>
         <w:ilvl w:val="1"/>
@@ -1737,7 +1737,7 @@
     <w:basedOn w:val="DefaultParagraphFont"/>
     <w:link w:val="Subtitle"/>
     <w:uiPriority w:val="11"/>
-    <w:rsid w:val="006C554B"/>
+    <w:rsid w:val="00A32097"/>
     <w:rPr>
       <w:rFonts w:eastAsiaTheme="majorEastAsia" w:cstheme="majorBidi"/>
       <w:color w:val="595959" w:themeColor="text1" w:themeTint="A6"/>
@@ -1753,7 +1753,7 @@
     <w:link w:val="QuoteChar"/>
     <w:uiPriority w:val="29"/>
     <w:qFormat/>
-    <w:rsid w:val="006C554B"/>
+    <w:rsid w:val="00A32097"/>
     <w:pPr>
       <w:spacing w:before="160"/>
       <w:jc w:val="center"/>
@@ -1769,7 +1769,7 @@
     <w:basedOn w:val="DefaultParagraphFont"/>
     <w:link w:val="Quote"/>
     <w:uiPriority w:val="29"/>
-    <w:rsid w:val="006C554B"/>
+    <w:rsid w:val="00A32097"/>
     <w:rPr>
       <w:i/>
       <w:iCs/>
@@ -1781,7 +1781,7 @@
     <w:basedOn w:val="Normal"/>
     <w:uiPriority w:val="34"/>
     <w:qFormat/>
-    <w:rsid w:val="006C554B"/>
+    <w:rsid w:val="00A32097"/>
     <w:pPr>
       <w:ind w:left="720"/>
       <w:contextualSpacing/>
@@ -1792,7 +1792,7 @@
     <w:basedOn w:val="DefaultParagraphFont"/>
     <w:uiPriority w:val="21"/>
     <w:qFormat/>
-    <w:rsid w:val="006C554B"/>
+    <w:rsid w:val="00A32097"/>
     <w:rPr>
       <w:i/>
       <w:iCs/>
@@ -1806,7 +1806,7 @@
     <w:link w:val="IntenseQuoteChar"/>
     <w:uiPriority w:val="30"/>
     <w:qFormat/>
-    <w:rsid w:val="006C554B"/>
+    <w:rsid w:val="00A32097"/>
     <w:pPr>
       <w:pBdr>
         <w:top w:val="single" w:sz="4" w:space="10" w:color="0F4761" w:themeColor="accent1" w:themeShade="BF"/>
@@ -1827,7 +1827,7 @@
     <w:basedOn w:val="DefaultParagraphFont"/>
     <w:link w:val="IntenseQuote"/>
     <w:uiPriority w:val="30"/>
-    <w:rsid w:val="006C554B"/>
+    <w:rsid w:val="00A32097"/>
     <w:rPr>
       <w:i/>
       <w:iCs/>
@@ -1839,7 +1839,7 @@
     <w:basedOn w:val="DefaultParagraphFont"/>
     <w:uiPriority w:val="32"/>
     <w:qFormat/>
-    <w:rsid w:val="006C554B"/>
+    <w:rsid w:val="00A32097"/>
     <w:rPr>
       <w:b/>
       <w:bCs/>

</xml_diff>

<commit_message>
hoan chinh phan kham benh cua FE
</commit_message>
<xml_diff>
--- a/DanhSachTiepNhan.docx
+++ b/DanhSachTiepNhan.docx
@@ -1339,7 +1339,7 @@
     <w:link w:val="Heading1Char"/>
     <w:uiPriority w:val="9"/>
     <w:qFormat/>
-    <w:rsid w:val="00A32097"/>
+    <w:rsid w:val="00335C18"/>
     <w:pPr>
       <w:keepNext/>
       <w:keepLines/>
@@ -1362,7 +1362,7 @@
     <w:semiHidden/>
     <w:unhideWhenUsed/>
     <w:qFormat/>
-    <w:rsid w:val="00A32097"/>
+    <w:rsid w:val="00335C18"/>
     <w:pPr>
       <w:keepNext/>
       <w:keepLines/>
@@ -1385,7 +1385,7 @@
     <w:semiHidden/>
     <w:unhideWhenUsed/>
     <w:qFormat/>
-    <w:rsid w:val="00A32097"/>
+    <w:rsid w:val="00335C18"/>
     <w:pPr>
       <w:keepNext/>
       <w:keepLines/>
@@ -1408,7 +1408,7 @@
     <w:semiHidden/>
     <w:unhideWhenUsed/>
     <w:qFormat/>
-    <w:rsid w:val="00A32097"/>
+    <w:rsid w:val="00335C18"/>
     <w:pPr>
       <w:keepNext/>
       <w:keepLines/>
@@ -1431,7 +1431,7 @@
     <w:semiHidden/>
     <w:unhideWhenUsed/>
     <w:qFormat/>
-    <w:rsid w:val="00A32097"/>
+    <w:rsid w:val="00335C18"/>
     <w:pPr>
       <w:keepNext/>
       <w:keepLines/>
@@ -1452,7 +1452,7 @@
     <w:semiHidden/>
     <w:unhideWhenUsed/>
     <w:qFormat/>
-    <w:rsid w:val="00A32097"/>
+    <w:rsid w:val="00335C18"/>
     <w:pPr>
       <w:keepNext/>
       <w:keepLines/>
@@ -1475,7 +1475,7 @@
     <w:semiHidden/>
     <w:unhideWhenUsed/>
     <w:qFormat/>
-    <w:rsid w:val="00A32097"/>
+    <w:rsid w:val="00335C18"/>
     <w:pPr>
       <w:keepNext/>
       <w:keepLines/>
@@ -1496,7 +1496,7 @@
     <w:semiHidden/>
     <w:unhideWhenUsed/>
     <w:qFormat/>
-    <w:rsid w:val="00A32097"/>
+    <w:rsid w:val="00335C18"/>
     <w:pPr>
       <w:keepNext/>
       <w:keepLines/>
@@ -1519,7 +1519,7 @@
     <w:semiHidden/>
     <w:unhideWhenUsed/>
     <w:qFormat/>
-    <w:rsid w:val="00A32097"/>
+    <w:rsid w:val="00335C18"/>
     <w:pPr>
       <w:keepNext/>
       <w:keepLines/>
@@ -1563,7 +1563,7 @@
     <w:basedOn w:val="DefaultParagraphFont"/>
     <w:link w:val="Heading1"/>
     <w:uiPriority w:val="9"/>
-    <w:rsid w:val="00A32097"/>
+    <w:rsid w:val="00335C18"/>
     <w:rPr>
       <w:rFonts w:asciiTheme="majorHAnsi" w:eastAsiaTheme="majorEastAsia" w:hAnsiTheme="majorHAnsi" w:cstheme="majorBidi"/>
       <w:color w:val="0F4761" w:themeColor="accent1" w:themeShade="BF"/>
@@ -1577,7 +1577,7 @@
     <w:link w:val="Heading2"/>
     <w:uiPriority w:val="9"/>
     <w:semiHidden/>
-    <w:rsid w:val="00A32097"/>
+    <w:rsid w:val="00335C18"/>
     <w:rPr>
       <w:rFonts w:asciiTheme="majorHAnsi" w:eastAsiaTheme="majorEastAsia" w:hAnsiTheme="majorHAnsi" w:cstheme="majorBidi"/>
       <w:color w:val="0F4761" w:themeColor="accent1" w:themeShade="BF"/>
@@ -1591,7 +1591,7 @@
     <w:link w:val="Heading3"/>
     <w:uiPriority w:val="9"/>
     <w:semiHidden/>
-    <w:rsid w:val="00A32097"/>
+    <w:rsid w:val="00335C18"/>
     <w:rPr>
       <w:rFonts w:eastAsiaTheme="majorEastAsia" w:cstheme="majorBidi"/>
       <w:color w:val="0F4761" w:themeColor="accent1" w:themeShade="BF"/>
@@ -1605,7 +1605,7 @@
     <w:link w:val="Heading4"/>
     <w:uiPriority w:val="9"/>
     <w:semiHidden/>
-    <w:rsid w:val="00A32097"/>
+    <w:rsid w:val="00335C18"/>
     <w:rPr>
       <w:rFonts w:eastAsiaTheme="majorEastAsia" w:cstheme="majorBidi"/>
       <w:i/>
@@ -1619,7 +1619,7 @@
     <w:link w:val="Heading5"/>
     <w:uiPriority w:val="9"/>
     <w:semiHidden/>
-    <w:rsid w:val="00A32097"/>
+    <w:rsid w:val="00335C18"/>
     <w:rPr>
       <w:rFonts w:eastAsiaTheme="majorEastAsia" w:cstheme="majorBidi"/>
       <w:color w:val="0F4761" w:themeColor="accent1" w:themeShade="BF"/>
@@ -1631,7 +1631,7 @@
     <w:link w:val="Heading6"/>
     <w:uiPriority w:val="9"/>
     <w:semiHidden/>
-    <w:rsid w:val="00A32097"/>
+    <w:rsid w:val="00335C18"/>
     <w:rPr>
       <w:rFonts w:eastAsiaTheme="majorEastAsia" w:cstheme="majorBidi"/>
       <w:i/>
@@ -1645,7 +1645,7 @@
     <w:link w:val="Heading7"/>
     <w:uiPriority w:val="9"/>
     <w:semiHidden/>
-    <w:rsid w:val="00A32097"/>
+    <w:rsid w:val="00335C18"/>
     <w:rPr>
       <w:rFonts w:eastAsiaTheme="majorEastAsia" w:cstheme="majorBidi"/>
       <w:color w:val="595959" w:themeColor="text1" w:themeTint="A6"/>
@@ -1657,7 +1657,7 @@
     <w:link w:val="Heading8"/>
     <w:uiPriority w:val="9"/>
     <w:semiHidden/>
-    <w:rsid w:val="00A32097"/>
+    <w:rsid w:val="00335C18"/>
     <w:rPr>
       <w:rFonts w:eastAsiaTheme="majorEastAsia" w:cstheme="majorBidi"/>
       <w:i/>
@@ -1671,7 +1671,7 @@
     <w:link w:val="Heading9"/>
     <w:uiPriority w:val="9"/>
     <w:semiHidden/>
-    <w:rsid w:val="00A32097"/>
+    <w:rsid w:val="00335C18"/>
     <w:rPr>
       <w:rFonts w:eastAsiaTheme="majorEastAsia" w:cstheme="majorBidi"/>
       <w:color w:val="272727" w:themeColor="text1" w:themeTint="D8"/>
@@ -1684,7 +1684,7 @@
     <w:link w:val="TitleChar"/>
     <w:uiPriority w:val="10"/>
     <w:qFormat/>
-    <w:rsid w:val="00A32097"/>
+    <w:rsid w:val="00335C18"/>
     <w:pPr>
       <w:spacing w:after="80" w:line="240" w:lineRule="auto"/>
       <w:contextualSpacing/>
@@ -1702,7 +1702,7 @@
     <w:basedOn w:val="DefaultParagraphFont"/>
     <w:link w:val="Title"/>
     <w:uiPriority w:val="10"/>
-    <w:rsid w:val="00A32097"/>
+    <w:rsid w:val="00335C18"/>
     <w:rPr>
       <w:rFonts w:asciiTheme="majorHAnsi" w:eastAsiaTheme="majorEastAsia" w:hAnsiTheme="majorHAnsi" w:cstheme="majorBidi"/>
       <w:spacing w:val="-10"/>
@@ -1718,7 +1718,7 @@
     <w:link w:val="SubtitleChar"/>
     <w:uiPriority w:val="11"/>
     <w:qFormat/>
-    <w:rsid w:val="00A32097"/>
+    <w:rsid w:val="00335C18"/>
     <w:pPr>
       <w:numPr>
         <w:ilvl w:val="1"/>
@@ -1737,7 +1737,7 @@
     <w:basedOn w:val="DefaultParagraphFont"/>
     <w:link w:val="Subtitle"/>
     <w:uiPriority w:val="11"/>
-    <w:rsid w:val="00A32097"/>
+    <w:rsid w:val="00335C18"/>
     <w:rPr>
       <w:rFonts w:eastAsiaTheme="majorEastAsia" w:cstheme="majorBidi"/>
       <w:color w:val="595959" w:themeColor="text1" w:themeTint="A6"/>
@@ -1753,7 +1753,7 @@
     <w:link w:val="QuoteChar"/>
     <w:uiPriority w:val="29"/>
     <w:qFormat/>
-    <w:rsid w:val="00A32097"/>
+    <w:rsid w:val="00335C18"/>
     <w:pPr>
       <w:spacing w:before="160"/>
       <w:jc w:val="center"/>
@@ -1769,7 +1769,7 @@
     <w:basedOn w:val="DefaultParagraphFont"/>
     <w:link w:val="Quote"/>
     <w:uiPriority w:val="29"/>
-    <w:rsid w:val="00A32097"/>
+    <w:rsid w:val="00335C18"/>
     <w:rPr>
       <w:i/>
       <w:iCs/>
@@ -1781,7 +1781,7 @@
     <w:basedOn w:val="Normal"/>
     <w:uiPriority w:val="34"/>
     <w:qFormat/>
-    <w:rsid w:val="00A32097"/>
+    <w:rsid w:val="00335C18"/>
     <w:pPr>
       <w:ind w:left="720"/>
       <w:contextualSpacing/>
@@ -1792,7 +1792,7 @@
     <w:basedOn w:val="DefaultParagraphFont"/>
     <w:uiPriority w:val="21"/>
     <w:qFormat/>
-    <w:rsid w:val="00A32097"/>
+    <w:rsid w:val="00335C18"/>
     <w:rPr>
       <w:i/>
       <w:iCs/>
@@ -1806,7 +1806,7 @@
     <w:link w:val="IntenseQuoteChar"/>
     <w:uiPriority w:val="30"/>
     <w:qFormat/>
-    <w:rsid w:val="00A32097"/>
+    <w:rsid w:val="00335C18"/>
     <w:pPr>
       <w:pBdr>
         <w:top w:val="single" w:sz="4" w:space="10" w:color="0F4761" w:themeColor="accent1" w:themeShade="BF"/>
@@ -1827,7 +1827,7 @@
     <w:basedOn w:val="DefaultParagraphFont"/>
     <w:link w:val="IntenseQuote"/>
     <w:uiPriority w:val="30"/>
-    <w:rsid w:val="00A32097"/>
+    <w:rsid w:val="00335C18"/>
     <w:rPr>
       <w:i/>
       <w:iCs/>
@@ -1839,7 +1839,7 @@
     <w:basedOn w:val="DefaultParagraphFont"/>
     <w:uiPriority w:val="32"/>
     <w:qFormat/>
-    <w:rsid w:val="00A32097"/>
+    <w:rsid w:val="00335C18"/>
     <w:rPr>
       <w:b/>
       <w:bCs/>

</xml_diff>

<commit_message>
sua giao dien chon dich vu va chon thuoc
</commit_message>
<xml_diff>
--- a/DanhSachTiepNhan.docx
+++ b/DanhSachTiepNhan.docx
@@ -1339,7 +1339,7 @@
     <w:link w:val="Heading1Char"/>
     <w:uiPriority w:val="9"/>
     <w:qFormat/>
-    <w:rsid w:val="00335C18"/>
+    <w:rsid w:val="00BA639C"/>
     <w:pPr>
       <w:keepNext/>
       <w:keepLines/>
@@ -1362,7 +1362,7 @@
     <w:semiHidden/>
     <w:unhideWhenUsed/>
     <w:qFormat/>
-    <w:rsid w:val="00335C18"/>
+    <w:rsid w:val="00BA639C"/>
     <w:pPr>
       <w:keepNext/>
       <w:keepLines/>
@@ -1385,7 +1385,7 @@
     <w:semiHidden/>
     <w:unhideWhenUsed/>
     <w:qFormat/>
-    <w:rsid w:val="00335C18"/>
+    <w:rsid w:val="00BA639C"/>
     <w:pPr>
       <w:keepNext/>
       <w:keepLines/>
@@ -1408,7 +1408,7 @@
     <w:semiHidden/>
     <w:unhideWhenUsed/>
     <w:qFormat/>
-    <w:rsid w:val="00335C18"/>
+    <w:rsid w:val="00BA639C"/>
     <w:pPr>
       <w:keepNext/>
       <w:keepLines/>
@@ -1431,7 +1431,7 @@
     <w:semiHidden/>
     <w:unhideWhenUsed/>
     <w:qFormat/>
-    <w:rsid w:val="00335C18"/>
+    <w:rsid w:val="00BA639C"/>
     <w:pPr>
       <w:keepNext/>
       <w:keepLines/>
@@ -1452,7 +1452,7 @@
     <w:semiHidden/>
     <w:unhideWhenUsed/>
     <w:qFormat/>
-    <w:rsid w:val="00335C18"/>
+    <w:rsid w:val="00BA639C"/>
     <w:pPr>
       <w:keepNext/>
       <w:keepLines/>
@@ -1475,7 +1475,7 @@
     <w:semiHidden/>
     <w:unhideWhenUsed/>
     <w:qFormat/>
-    <w:rsid w:val="00335C18"/>
+    <w:rsid w:val="00BA639C"/>
     <w:pPr>
       <w:keepNext/>
       <w:keepLines/>
@@ -1496,7 +1496,7 @@
     <w:semiHidden/>
     <w:unhideWhenUsed/>
     <w:qFormat/>
-    <w:rsid w:val="00335C18"/>
+    <w:rsid w:val="00BA639C"/>
     <w:pPr>
       <w:keepNext/>
       <w:keepLines/>
@@ -1519,7 +1519,7 @@
     <w:semiHidden/>
     <w:unhideWhenUsed/>
     <w:qFormat/>
-    <w:rsid w:val="00335C18"/>
+    <w:rsid w:val="00BA639C"/>
     <w:pPr>
       <w:keepNext/>
       <w:keepLines/>
@@ -1563,7 +1563,7 @@
     <w:basedOn w:val="DefaultParagraphFont"/>
     <w:link w:val="Heading1"/>
     <w:uiPriority w:val="9"/>
-    <w:rsid w:val="00335C18"/>
+    <w:rsid w:val="00BA639C"/>
     <w:rPr>
       <w:rFonts w:asciiTheme="majorHAnsi" w:eastAsiaTheme="majorEastAsia" w:hAnsiTheme="majorHAnsi" w:cstheme="majorBidi"/>
       <w:color w:val="0F4761" w:themeColor="accent1" w:themeShade="BF"/>
@@ -1577,7 +1577,7 @@
     <w:link w:val="Heading2"/>
     <w:uiPriority w:val="9"/>
     <w:semiHidden/>
-    <w:rsid w:val="00335C18"/>
+    <w:rsid w:val="00BA639C"/>
     <w:rPr>
       <w:rFonts w:asciiTheme="majorHAnsi" w:eastAsiaTheme="majorEastAsia" w:hAnsiTheme="majorHAnsi" w:cstheme="majorBidi"/>
       <w:color w:val="0F4761" w:themeColor="accent1" w:themeShade="BF"/>
@@ -1591,7 +1591,7 @@
     <w:link w:val="Heading3"/>
     <w:uiPriority w:val="9"/>
     <w:semiHidden/>
-    <w:rsid w:val="00335C18"/>
+    <w:rsid w:val="00BA639C"/>
     <w:rPr>
       <w:rFonts w:eastAsiaTheme="majorEastAsia" w:cstheme="majorBidi"/>
       <w:color w:val="0F4761" w:themeColor="accent1" w:themeShade="BF"/>
@@ -1605,7 +1605,7 @@
     <w:link w:val="Heading4"/>
     <w:uiPriority w:val="9"/>
     <w:semiHidden/>
-    <w:rsid w:val="00335C18"/>
+    <w:rsid w:val="00BA639C"/>
     <w:rPr>
       <w:rFonts w:eastAsiaTheme="majorEastAsia" w:cstheme="majorBidi"/>
       <w:i/>
@@ -1619,7 +1619,7 @@
     <w:link w:val="Heading5"/>
     <w:uiPriority w:val="9"/>
     <w:semiHidden/>
-    <w:rsid w:val="00335C18"/>
+    <w:rsid w:val="00BA639C"/>
     <w:rPr>
       <w:rFonts w:eastAsiaTheme="majorEastAsia" w:cstheme="majorBidi"/>
       <w:color w:val="0F4761" w:themeColor="accent1" w:themeShade="BF"/>
@@ -1631,7 +1631,7 @@
     <w:link w:val="Heading6"/>
     <w:uiPriority w:val="9"/>
     <w:semiHidden/>
-    <w:rsid w:val="00335C18"/>
+    <w:rsid w:val="00BA639C"/>
     <w:rPr>
       <w:rFonts w:eastAsiaTheme="majorEastAsia" w:cstheme="majorBidi"/>
       <w:i/>
@@ -1645,7 +1645,7 @@
     <w:link w:val="Heading7"/>
     <w:uiPriority w:val="9"/>
     <w:semiHidden/>
-    <w:rsid w:val="00335C18"/>
+    <w:rsid w:val="00BA639C"/>
     <w:rPr>
       <w:rFonts w:eastAsiaTheme="majorEastAsia" w:cstheme="majorBidi"/>
       <w:color w:val="595959" w:themeColor="text1" w:themeTint="A6"/>
@@ -1657,7 +1657,7 @@
     <w:link w:val="Heading8"/>
     <w:uiPriority w:val="9"/>
     <w:semiHidden/>
-    <w:rsid w:val="00335C18"/>
+    <w:rsid w:val="00BA639C"/>
     <w:rPr>
       <w:rFonts w:eastAsiaTheme="majorEastAsia" w:cstheme="majorBidi"/>
       <w:i/>
@@ -1671,7 +1671,7 @@
     <w:link w:val="Heading9"/>
     <w:uiPriority w:val="9"/>
     <w:semiHidden/>
-    <w:rsid w:val="00335C18"/>
+    <w:rsid w:val="00BA639C"/>
     <w:rPr>
       <w:rFonts w:eastAsiaTheme="majorEastAsia" w:cstheme="majorBidi"/>
       <w:color w:val="272727" w:themeColor="text1" w:themeTint="D8"/>
@@ -1684,7 +1684,7 @@
     <w:link w:val="TitleChar"/>
     <w:uiPriority w:val="10"/>
     <w:qFormat/>
-    <w:rsid w:val="00335C18"/>
+    <w:rsid w:val="00BA639C"/>
     <w:pPr>
       <w:spacing w:after="80" w:line="240" w:lineRule="auto"/>
       <w:contextualSpacing/>
@@ -1702,7 +1702,7 @@
     <w:basedOn w:val="DefaultParagraphFont"/>
     <w:link w:val="Title"/>
     <w:uiPriority w:val="10"/>
-    <w:rsid w:val="00335C18"/>
+    <w:rsid w:val="00BA639C"/>
     <w:rPr>
       <w:rFonts w:asciiTheme="majorHAnsi" w:eastAsiaTheme="majorEastAsia" w:hAnsiTheme="majorHAnsi" w:cstheme="majorBidi"/>
       <w:spacing w:val="-10"/>
@@ -1718,7 +1718,7 @@
     <w:link w:val="SubtitleChar"/>
     <w:uiPriority w:val="11"/>
     <w:qFormat/>
-    <w:rsid w:val="00335C18"/>
+    <w:rsid w:val="00BA639C"/>
     <w:pPr>
       <w:numPr>
         <w:ilvl w:val="1"/>
@@ -1737,7 +1737,7 @@
     <w:basedOn w:val="DefaultParagraphFont"/>
     <w:link w:val="Subtitle"/>
     <w:uiPriority w:val="11"/>
-    <w:rsid w:val="00335C18"/>
+    <w:rsid w:val="00BA639C"/>
     <w:rPr>
       <w:rFonts w:eastAsiaTheme="majorEastAsia" w:cstheme="majorBidi"/>
       <w:color w:val="595959" w:themeColor="text1" w:themeTint="A6"/>
@@ -1753,7 +1753,7 @@
     <w:link w:val="QuoteChar"/>
     <w:uiPriority w:val="29"/>
     <w:qFormat/>
-    <w:rsid w:val="00335C18"/>
+    <w:rsid w:val="00BA639C"/>
     <w:pPr>
       <w:spacing w:before="160"/>
       <w:jc w:val="center"/>
@@ -1769,7 +1769,7 @@
     <w:basedOn w:val="DefaultParagraphFont"/>
     <w:link w:val="Quote"/>
     <w:uiPriority w:val="29"/>
-    <w:rsid w:val="00335C18"/>
+    <w:rsid w:val="00BA639C"/>
     <w:rPr>
       <w:i/>
       <w:iCs/>
@@ -1781,7 +1781,7 @@
     <w:basedOn w:val="Normal"/>
     <w:uiPriority w:val="34"/>
     <w:qFormat/>
-    <w:rsid w:val="00335C18"/>
+    <w:rsid w:val="00BA639C"/>
     <w:pPr>
       <w:ind w:left="720"/>
       <w:contextualSpacing/>
@@ -1792,7 +1792,7 @@
     <w:basedOn w:val="DefaultParagraphFont"/>
     <w:uiPriority w:val="21"/>
     <w:qFormat/>
-    <w:rsid w:val="00335C18"/>
+    <w:rsid w:val="00BA639C"/>
     <w:rPr>
       <w:i/>
       <w:iCs/>
@@ -1806,7 +1806,7 @@
     <w:link w:val="IntenseQuoteChar"/>
     <w:uiPriority w:val="30"/>
     <w:qFormat/>
-    <w:rsid w:val="00335C18"/>
+    <w:rsid w:val="00BA639C"/>
     <w:pPr>
       <w:pBdr>
         <w:top w:val="single" w:sz="4" w:space="10" w:color="0F4761" w:themeColor="accent1" w:themeShade="BF"/>
@@ -1827,7 +1827,7 @@
     <w:basedOn w:val="DefaultParagraphFont"/>
     <w:link w:val="IntenseQuote"/>
     <w:uiPriority w:val="30"/>
-    <w:rsid w:val="00335C18"/>
+    <w:rsid w:val="00BA639C"/>
     <w:rPr>
       <w:i/>
       <w:iCs/>
@@ -1839,7 +1839,7 @@
     <w:basedOn w:val="DefaultParagraphFont"/>
     <w:uiPriority w:val="32"/>
     <w:qFormat/>
-    <w:rsid w:val="00335C18"/>
+    <w:rsid w:val="00BA639C"/>
     <w:rPr>
       <w:b/>
       <w:bCs/>

</xml_diff>

<commit_message>
chua the ke thuoc duoc, con lai da on dinh
</commit_message>
<xml_diff>
--- a/DanhSachTiepNhan.docx
+++ b/DanhSachTiepNhan.docx
@@ -1339,7 +1339,7 @@
     <w:link w:val="Heading1Char"/>
     <w:uiPriority w:val="9"/>
     <w:qFormat/>
-    <w:rsid w:val="00BA639C"/>
+    <w:rsid w:val="00320724"/>
     <w:pPr>
       <w:keepNext/>
       <w:keepLines/>
@@ -1362,7 +1362,7 @@
     <w:semiHidden/>
     <w:unhideWhenUsed/>
     <w:qFormat/>
-    <w:rsid w:val="00BA639C"/>
+    <w:rsid w:val="00320724"/>
     <w:pPr>
       <w:keepNext/>
       <w:keepLines/>
@@ -1385,7 +1385,7 @@
     <w:semiHidden/>
     <w:unhideWhenUsed/>
     <w:qFormat/>
-    <w:rsid w:val="00BA639C"/>
+    <w:rsid w:val="00320724"/>
     <w:pPr>
       <w:keepNext/>
       <w:keepLines/>
@@ -1408,7 +1408,7 @@
     <w:semiHidden/>
     <w:unhideWhenUsed/>
     <w:qFormat/>
-    <w:rsid w:val="00BA639C"/>
+    <w:rsid w:val="00320724"/>
     <w:pPr>
       <w:keepNext/>
       <w:keepLines/>
@@ -1431,7 +1431,7 @@
     <w:semiHidden/>
     <w:unhideWhenUsed/>
     <w:qFormat/>
-    <w:rsid w:val="00BA639C"/>
+    <w:rsid w:val="00320724"/>
     <w:pPr>
       <w:keepNext/>
       <w:keepLines/>
@@ -1452,7 +1452,7 @@
     <w:semiHidden/>
     <w:unhideWhenUsed/>
     <w:qFormat/>
-    <w:rsid w:val="00BA639C"/>
+    <w:rsid w:val="00320724"/>
     <w:pPr>
       <w:keepNext/>
       <w:keepLines/>
@@ -1475,7 +1475,7 @@
     <w:semiHidden/>
     <w:unhideWhenUsed/>
     <w:qFormat/>
-    <w:rsid w:val="00BA639C"/>
+    <w:rsid w:val="00320724"/>
     <w:pPr>
       <w:keepNext/>
       <w:keepLines/>
@@ -1496,7 +1496,7 @@
     <w:semiHidden/>
     <w:unhideWhenUsed/>
     <w:qFormat/>
-    <w:rsid w:val="00BA639C"/>
+    <w:rsid w:val="00320724"/>
     <w:pPr>
       <w:keepNext/>
       <w:keepLines/>
@@ -1519,7 +1519,7 @@
     <w:semiHidden/>
     <w:unhideWhenUsed/>
     <w:qFormat/>
-    <w:rsid w:val="00BA639C"/>
+    <w:rsid w:val="00320724"/>
     <w:pPr>
       <w:keepNext/>
       <w:keepLines/>
@@ -1563,7 +1563,7 @@
     <w:basedOn w:val="DefaultParagraphFont"/>
     <w:link w:val="Heading1"/>
     <w:uiPriority w:val="9"/>
-    <w:rsid w:val="00BA639C"/>
+    <w:rsid w:val="00320724"/>
     <w:rPr>
       <w:rFonts w:asciiTheme="majorHAnsi" w:eastAsiaTheme="majorEastAsia" w:hAnsiTheme="majorHAnsi" w:cstheme="majorBidi"/>
       <w:color w:val="0F4761" w:themeColor="accent1" w:themeShade="BF"/>
@@ -1577,7 +1577,7 @@
     <w:link w:val="Heading2"/>
     <w:uiPriority w:val="9"/>
     <w:semiHidden/>
-    <w:rsid w:val="00BA639C"/>
+    <w:rsid w:val="00320724"/>
     <w:rPr>
       <w:rFonts w:asciiTheme="majorHAnsi" w:eastAsiaTheme="majorEastAsia" w:hAnsiTheme="majorHAnsi" w:cstheme="majorBidi"/>
       <w:color w:val="0F4761" w:themeColor="accent1" w:themeShade="BF"/>
@@ -1591,7 +1591,7 @@
     <w:link w:val="Heading3"/>
     <w:uiPriority w:val="9"/>
     <w:semiHidden/>
-    <w:rsid w:val="00BA639C"/>
+    <w:rsid w:val="00320724"/>
     <w:rPr>
       <w:rFonts w:eastAsiaTheme="majorEastAsia" w:cstheme="majorBidi"/>
       <w:color w:val="0F4761" w:themeColor="accent1" w:themeShade="BF"/>
@@ -1605,7 +1605,7 @@
     <w:link w:val="Heading4"/>
     <w:uiPriority w:val="9"/>
     <w:semiHidden/>
-    <w:rsid w:val="00BA639C"/>
+    <w:rsid w:val="00320724"/>
     <w:rPr>
       <w:rFonts w:eastAsiaTheme="majorEastAsia" w:cstheme="majorBidi"/>
       <w:i/>
@@ -1619,7 +1619,7 @@
     <w:link w:val="Heading5"/>
     <w:uiPriority w:val="9"/>
     <w:semiHidden/>
-    <w:rsid w:val="00BA639C"/>
+    <w:rsid w:val="00320724"/>
     <w:rPr>
       <w:rFonts w:eastAsiaTheme="majorEastAsia" w:cstheme="majorBidi"/>
       <w:color w:val="0F4761" w:themeColor="accent1" w:themeShade="BF"/>
@@ -1631,7 +1631,7 @@
     <w:link w:val="Heading6"/>
     <w:uiPriority w:val="9"/>
     <w:semiHidden/>
-    <w:rsid w:val="00BA639C"/>
+    <w:rsid w:val="00320724"/>
     <w:rPr>
       <w:rFonts w:eastAsiaTheme="majorEastAsia" w:cstheme="majorBidi"/>
       <w:i/>
@@ -1645,7 +1645,7 @@
     <w:link w:val="Heading7"/>
     <w:uiPriority w:val="9"/>
     <w:semiHidden/>
-    <w:rsid w:val="00BA639C"/>
+    <w:rsid w:val="00320724"/>
     <w:rPr>
       <w:rFonts w:eastAsiaTheme="majorEastAsia" w:cstheme="majorBidi"/>
       <w:color w:val="595959" w:themeColor="text1" w:themeTint="A6"/>
@@ -1657,7 +1657,7 @@
     <w:link w:val="Heading8"/>
     <w:uiPriority w:val="9"/>
     <w:semiHidden/>
-    <w:rsid w:val="00BA639C"/>
+    <w:rsid w:val="00320724"/>
     <w:rPr>
       <w:rFonts w:eastAsiaTheme="majorEastAsia" w:cstheme="majorBidi"/>
       <w:i/>
@@ -1671,7 +1671,7 @@
     <w:link w:val="Heading9"/>
     <w:uiPriority w:val="9"/>
     <w:semiHidden/>
-    <w:rsid w:val="00BA639C"/>
+    <w:rsid w:val="00320724"/>
     <w:rPr>
       <w:rFonts w:eastAsiaTheme="majorEastAsia" w:cstheme="majorBidi"/>
       <w:color w:val="272727" w:themeColor="text1" w:themeTint="D8"/>
@@ -1684,7 +1684,7 @@
     <w:link w:val="TitleChar"/>
     <w:uiPriority w:val="10"/>
     <w:qFormat/>
-    <w:rsid w:val="00BA639C"/>
+    <w:rsid w:val="00320724"/>
     <w:pPr>
       <w:spacing w:after="80" w:line="240" w:lineRule="auto"/>
       <w:contextualSpacing/>
@@ -1702,7 +1702,7 @@
     <w:basedOn w:val="DefaultParagraphFont"/>
     <w:link w:val="Title"/>
     <w:uiPriority w:val="10"/>
-    <w:rsid w:val="00BA639C"/>
+    <w:rsid w:val="00320724"/>
     <w:rPr>
       <w:rFonts w:asciiTheme="majorHAnsi" w:eastAsiaTheme="majorEastAsia" w:hAnsiTheme="majorHAnsi" w:cstheme="majorBidi"/>
       <w:spacing w:val="-10"/>
@@ -1718,7 +1718,7 @@
     <w:link w:val="SubtitleChar"/>
     <w:uiPriority w:val="11"/>
     <w:qFormat/>
-    <w:rsid w:val="00BA639C"/>
+    <w:rsid w:val="00320724"/>
     <w:pPr>
       <w:numPr>
         <w:ilvl w:val="1"/>
@@ -1737,7 +1737,7 @@
     <w:basedOn w:val="DefaultParagraphFont"/>
     <w:link w:val="Subtitle"/>
     <w:uiPriority w:val="11"/>
-    <w:rsid w:val="00BA639C"/>
+    <w:rsid w:val="00320724"/>
     <w:rPr>
       <w:rFonts w:eastAsiaTheme="majorEastAsia" w:cstheme="majorBidi"/>
       <w:color w:val="595959" w:themeColor="text1" w:themeTint="A6"/>
@@ -1753,7 +1753,7 @@
     <w:link w:val="QuoteChar"/>
     <w:uiPriority w:val="29"/>
     <w:qFormat/>
-    <w:rsid w:val="00BA639C"/>
+    <w:rsid w:val="00320724"/>
     <w:pPr>
       <w:spacing w:before="160"/>
       <w:jc w:val="center"/>
@@ -1769,7 +1769,7 @@
     <w:basedOn w:val="DefaultParagraphFont"/>
     <w:link w:val="Quote"/>
     <w:uiPriority w:val="29"/>
-    <w:rsid w:val="00BA639C"/>
+    <w:rsid w:val="00320724"/>
     <w:rPr>
       <w:i/>
       <w:iCs/>
@@ -1781,7 +1781,7 @@
     <w:basedOn w:val="Normal"/>
     <w:uiPriority w:val="34"/>
     <w:qFormat/>
-    <w:rsid w:val="00BA639C"/>
+    <w:rsid w:val="00320724"/>
     <w:pPr>
       <w:ind w:left="720"/>
       <w:contextualSpacing/>
@@ -1792,7 +1792,7 @@
     <w:basedOn w:val="DefaultParagraphFont"/>
     <w:uiPriority w:val="21"/>
     <w:qFormat/>
-    <w:rsid w:val="00BA639C"/>
+    <w:rsid w:val="00320724"/>
     <w:rPr>
       <w:i/>
       <w:iCs/>
@@ -1806,7 +1806,7 @@
     <w:link w:val="IntenseQuoteChar"/>
     <w:uiPriority w:val="30"/>
     <w:qFormat/>
-    <w:rsid w:val="00BA639C"/>
+    <w:rsid w:val="00320724"/>
     <w:pPr>
       <w:pBdr>
         <w:top w:val="single" w:sz="4" w:space="10" w:color="0F4761" w:themeColor="accent1" w:themeShade="BF"/>
@@ -1827,7 +1827,7 @@
     <w:basedOn w:val="DefaultParagraphFont"/>
     <w:link w:val="IntenseQuote"/>
     <w:uiPriority w:val="30"/>
-    <w:rsid w:val="00BA639C"/>
+    <w:rsid w:val="00320724"/>
     <w:rPr>
       <w:i/>
       <w:iCs/>
@@ -1839,7 +1839,7 @@
     <w:basedOn w:val="DefaultParagraphFont"/>
     <w:uiPriority w:val="32"/>
     <w:qFormat/>
-    <w:rsid w:val="00BA639C"/>
+    <w:rsid w:val="00320724"/>
     <w:rPr>
       <w:b/>
       <w:bCs/>

</xml_diff>

<commit_message>
tach rieng dong va cap nhat chinh xac dong logic don thuoc va ket thuc kham trong file word
</commit_message>
<xml_diff>
--- a/DanhSachTiepNhan.docx
+++ b/DanhSachTiepNhan.docx
@@ -2016,7 +2016,7 @@
     <w:link w:val="Heading1Char"/>
     <w:uiPriority w:val="9"/>
     <w:qFormat/>
-    <w:rsid w:val="00302977"/>
+    <w:rsid w:val="00923C51"/>
     <w:pPr>
       <w:keepNext/>
       <w:keepLines/>
@@ -2039,7 +2039,7 @@
     <w:semiHidden/>
     <w:unhideWhenUsed/>
     <w:qFormat/>
-    <w:rsid w:val="00302977"/>
+    <w:rsid w:val="00923C51"/>
     <w:pPr>
       <w:keepNext/>
       <w:keepLines/>
@@ -2062,7 +2062,7 @@
     <w:semiHidden/>
     <w:unhideWhenUsed/>
     <w:qFormat/>
-    <w:rsid w:val="00302977"/>
+    <w:rsid w:val="00923C51"/>
     <w:pPr>
       <w:keepNext/>
       <w:keepLines/>
@@ -2085,7 +2085,7 @@
     <w:semiHidden/>
     <w:unhideWhenUsed/>
     <w:qFormat/>
-    <w:rsid w:val="00302977"/>
+    <w:rsid w:val="00923C51"/>
     <w:pPr>
       <w:keepNext/>
       <w:keepLines/>
@@ -2108,7 +2108,7 @@
     <w:semiHidden/>
     <w:unhideWhenUsed/>
     <w:qFormat/>
-    <w:rsid w:val="00302977"/>
+    <w:rsid w:val="00923C51"/>
     <w:pPr>
       <w:keepNext/>
       <w:keepLines/>
@@ -2129,7 +2129,7 @@
     <w:semiHidden/>
     <w:unhideWhenUsed/>
     <w:qFormat/>
-    <w:rsid w:val="00302977"/>
+    <w:rsid w:val="00923C51"/>
     <w:pPr>
       <w:keepNext/>
       <w:keepLines/>
@@ -2152,7 +2152,7 @@
     <w:semiHidden/>
     <w:unhideWhenUsed/>
     <w:qFormat/>
-    <w:rsid w:val="00302977"/>
+    <w:rsid w:val="00923C51"/>
     <w:pPr>
       <w:keepNext/>
       <w:keepLines/>
@@ -2173,7 +2173,7 @@
     <w:semiHidden/>
     <w:unhideWhenUsed/>
     <w:qFormat/>
-    <w:rsid w:val="00302977"/>
+    <w:rsid w:val="00923C51"/>
     <w:pPr>
       <w:keepNext/>
       <w:keepLines/>
@@ -2196,7 +2196,7 @@
     <w:semiHidden/>
     <w:unhideWhenUsed/>
     <w:qFormat/>
-    <w:rsid w:val="00302977"/>
+    <w:rsid w:val="00923C51"/>
     <w:pPr>
       <w:keepNext/>
       <w:keepLines/>
@@ -2240,7 +2240,7 @@
     <w:basedOn w:val="DefaultParagraphFont"/>
     <w:link w:val="Heading1"/>
     <w:uiPriority w:val="9"/>
-    <w:rsid w:val="00302977"/>
+    <w:rsid w:val="00923C51"/>
     <w:rPr>
       <w:rFonts w:asciiTheme="majorHAnsi" w:eastAsiaTheme="majorEastAsia" w:hAnsiTheme="majorHAnsi" w:cstheme="majorBidi"/>
       <w:color w:val="0F4761" w:themeColor="accent1" w:themeShade="BF"/>
@@ -2254,7 +2254,7 @@
     <w:link w:val="Heading2"/>
     <w:uiPriority w:val="9"/>
     <w:semiHidden/>
-    <w:rsid w:val="00302977"/>
+    <w:rsid w:val="00923C51"/>
     <w:rPr>
       <w:rFonts w:asciiTheme="majorHAnsi" w:eastAsiaTheme="majorEastAsia" w:hAnsiTheme="majorHAnsi" w:cstheme="majorBidi"/>
       <w:color w:val="0F4761" w:themeColor="accent1" w:themeShade="BF"/>
@@ -2268,7 +2268,7 @@
     <w:link w:val="Heading3"/>
     <w:uiPriority w:val="9"/>
     <w:semiHidden/>
-    <w:rsid w:val="00302977"/>
+    <w:rsid w:val="00923C51"/>
     <w:rPr>
       <w:rFonts w:eastAsiaTheme="majorEastAsia" w:cstheme="majorBidi"/>
       <w:color w:val="0F4761" w:themeColor="accent1" w:themeShade="BF"/>
@@ -2282,7 +2282,7 @@
     <w:link w:val="Heading4"/>
     <w:uiPriority w:val="9"/>
     <w:semiHidden/>
-    <w:rsid w:val="00302977"/>
+    <w:rsid w:val="00923C51"/>
     <w:rPr>
       <w:rFonts w:eastAsiaTheme="majorEastAsia" w:cstheme="majorBidi"/>
       <w:i/>
@@ -2296,7 +2296,7 @@
     <w:link w:val="Heading5"/>
     <w:uiPriority w:val="9"/>
     <w:semiHidden/>
-    <w:rsid w:val="00302977"/>
+    <w:rsid w:val="00923C51"/>
     <w:rPr>
       <w:rFonts w:eastAsiaTheme="majorEastAsia" w:cstheme="majorBidi"/>
       <w:color w:val="0F4761" w:themeColor="accent1" w:themeShade="BF"/>
@@ -2308,7 +2308,7 @@
     <w:link w:val="Heading6"/>
     <w:uiPriority w:val="9"/>
     <w:semiHidden/>
-    <w:rsid w:val="00302977"/>
+    <w:rsid w:val="00923C51"/>
     <w:rPr>
       <w:rFonts w:eastAsiaTheme="majorEastAsia" w:cstheme="majorBidi"/>
       <w:i/>
@@ -2322,7 +2322,7 @@
     <w:link w:val="Heading7"/>
     <w:uiPriority w:val="9"/>
     <w:semiHidden/>
-    <w:rsid w:val="00302977"/>
+    <w:rsid w:val="00923C51"/>
     <w:rPr>
       <w:rFonts w:eastAsiaTheme="majorEastAsia" w:cstheme="majorBidi"/>
       <w:color w:val="595959" w:themeColor="text1" w:themeTint="A6"/>
@@ -2334,7 +2334,7 @@
     <w:link w:val="Heading8"/>
     <w:uiPriority w:val="9"/>
     <w:semiHidden/>
-    <w:rsid w:val="00302977"/>
+    <w:rsid w:val="00923C51"/>
     <w:rPr>
       <w:rFonts w:eastAsiaTheme="majorEastAsia" w:cstheme="majorBidi"/>
       <w:i/>
@@ -2348,7 +2348,7 @@
     <w:link w:val="Heading9"/>
     <w:uiPriority w:val="9"/>
     <w:semiHidden/>
-    <w:rsid w:val="00302977"/>
+    <w:rsid w:val="00923C51"/>
     <w:rPr>
       <w:rFonts w:eastAsiaTheme="majorEastAsia" w:cstheme="majorBidi"/>
       <w:color w:val="272727" w:themeColor="text1" w:themeTint="D8"/>
@@ -2361,7 +2361,7 @@
     <w:link w:val="TitleChar"/>
     <w:uiPriority w:val="10"/>
     <w:qFormat/>
-    <w:rsid w:val="00302977"/>
+    <w:rsid w:val="00923C51"/>
     <w:pPr>
       <w:spacing w:after="80" w:line="240" w:lineRule="auto"/>
       <w:contextualSpacing/>
@@ -2379,7 +2379,7 @@
     <w:basedOn w:val="DefaultParagraphFont"/>
     <w:link w:val="Title"/>
     <w:uiPriority w:val="10"/>
-    <w:rsid w:val="00302977"/>
+    <w:rsid w:val="00923C51"/>
     <w:rPr>
       <w:rFonts w:asciiTheme="majorHAnsi" w:eastAsiaTheme="majorEastAsia" w:hAnsiTheme="majorHAnsi" w:cstheme="majorBidi"/>
       <w:spacing w:val="-10"/>
@@ -2395,7 +2395,7 @@
     <w:link w:val="SubtitleChar"/>
     <w:uiPriority w:val="11"/>
     <w:qFormat/>
-    <w:rsid w:val="00302977"/>
+    <w:rsid w:val="00923C51"/>
     <w:pPr>
       <w:numPr>
         <w:ilvl w:val="1"/>
@@ -2414,7 +2414,7 @@
     <w:basedOn w:val="DefaultParagraphFont"/>
     <w:link w:val="Subtitle"/>
     <w:uiPriority w:val="11"/>
-    <w:rsid w:val="00302977"/>
+    <w:rsid w:val="00923C51"/>
     <w:rPr>
       <w:rFonts w:eastAsiaTheme="majorEastAsia" w:cstheme="majorBidi"/>
       <w:color w:val="595959" w:themeColor="text1" w:themeTint="A6"/>
@@ -2430,7 +2430,7 @@
     <w:link w:val="QuoteChar"/>
     <w:uiPriority w:val="29"/>
     <w:qFormat/>
-    <w:rsid w:val="00302977"/>
+    <w:rsid w:val="00923C51"/>
     <w:pPr>
       <w:spacing w:before="160"/>
       <w:jc w:val="center"/>
@@ -2446,7 +2446,7 @@
     <w:basedOn w:val="DefaultParagraphFont"/>
     <w:link w:val="Quote"/>
     <w:uiPriority w:val="29"/>
-    <w:rsid w:val="00302977"/>
+    <w:rsid w:val="00923C51"/>
     <w:rPr>
       <w:i/>
       <w:iCs/>
@@ -2458,7 +2458,7 @@
     <w:basedOn w:val="Normal"/>
     <w:uiPriority w:val="34"/>
     <w:qFormat/>
-    <w:rsid w:val="00302977"/>
+    <w:rsid w:val="00923C51"/>
     <w:pPr>
       <w:ind w:left="720"/>
       <w:contextualSpacing/>
@@ -2469,7 +2469,7 @@
     <w:basedOn w:val="DefaultParagraphFont"/>
     <w:uiPriority w:val="21"/>
     <w:qFormat/>
-    <w:rsid w:val="00302977"/>
+    <w:rsid w:val="00923C51"/>
     <w:rPr>
       <w:i/>
       <w:iCs/>
@@ -2483,7 +2483,7 @@
     <w:link w:val="IntenseQuoteChar"/>
     <w:uiPriority w:val="30"/>
     <w:qFormat/>
-    <w:rsid w:val="00302977"/>
+    <w:rsid w:val="00923C51"/>
     <w:pPr>
       <w:pBdr>
         <w:top w:val="single" w:sz="4" w:space="10" w:color="0F4761" w:themeColor="accent1" w:themeShade="BF"/>
@@ -2504,7 +2504,7 @@
     <w:basedOn w:val="DefaultParagraphFont"/>
     <w:link w:val="IntenseQuote"/>
     <w:uiPriority w:val="30"/>
-    <w:rsid w:val="00302977"/>
+    <w:rsid w:val="00923C51"/>
     <w:rPr>
       <w:i/>
       <w:iCs/>
@@ -2516,7 +2516,7 @@
     <w:basedOn w:val="DefaultParagraphFont"/>
     <w:uiPriority w:val="32"/>
     <w:qFormat/>
-    <w:rsid w:val="00302977"/>
+    <w:rsid w:val="00923C51"/>
     <w:rPr>
       <w:b/>
       <w:bCs/>

</xml_diff>

<commit_message>
trang dat lich kham va fix kham benh fe
</commit_message>
<xml_diff>
--- a/DanhSachTiepNhan.docx
+++ b/DanhSachTiepNhan.docx
@@ -189,39 +189,39 @@
           <w:b/>
           <w:sz w:val="26"/>
         </w:rPr>
-        <w:t>2.1. Hàm gọi API lấy danh sách tiếp nhận (Dòng 232 - 245)</w:t>
-      </w:r>
-    </w:p>
-    <w:p>
-      <w:pPr>
-        <w:spacing w:before="80" w:after="80" w:line="240" w:lineRule="auto"/>
-        <w:rPr>
-          <w:rFonts w:ascii="Courier New" w:hAnsi="Courier New" w:cs="Courier New"/>
-          <w:sz w:val="19"/>
-        </w:rPr>
-      </w:pPr>
-      <w:r>
-        <w:rPr>
-          <w:rFonts w:ascii="Courier New" w:hAnsi="Courier New" w:cs="Courier New"/>
-          <w:sz w:val="19"/>
-        </w:rPr>
-        <w:t>// Dòng 232-245: Gửi yêu cầu GET kèm theo các tham số tìm kiếm, bác sĩ, trạng thái và ngày khám</w:t>
-      </w:r>
-    </w:p>
-    <w:p>
-      <w:pPr>
-        <w:spacing w:before="80" w:after="80" w:line="240" w:lineRule="auto"/>
-        <w:rPr>
-          <w:rFonts w:ascii="Courier New" w:hAnsi="Courier New" w:cs="Courier New"/>
-          <w:sz w:val="19"/>
-        </w:rPr>
-      </w:pPr>
-      <w:r>
-        <w:rPr>
-          <w:rFonts w:ascii="Courier New" w:hAnsi="Courier New" w:cs="Courier New"/>
-          <w:sz w:val="19"/>
-        </w:rPr>
-        <w:t>export const apiGetDanhSachTiepNhan = async ({ search = '', maNV = '', trangThai = '', ngayKham = '', page = 1, limit = 100 } = {}) =&gt; {</w:t>
+        <w:t>2.1. Hàm gọi API lấy danh sách tiếp nhận (Dòng 237 - 257)</w:t>
+      </w:r>
+    </w:p>
+    <w:p>
+      <w:pPr>
+        <w:spacing w:before="80" w:after="80" w:line="240" w:lineRule="auto"/>
+        <w:rPr>
+          <w:rFonts w:ascii="Courier New" w:hAnsi="Courier New" w:cs="Courier New"/>
+          <w:sz w:val="19"/>
+        </w:rPr>
+      </w:pPr>
+      <w:r>
+        <w:rPr>
+          <w:rFonts w:ascii="Courier New" w:hAnsi="Courier New" w:cs="Courier New"/>
+          <w:sz w:val="19"/>
+        </w:rPr>
+        <w:t>// Dòng 237-257: Gửi yêu cầu GET kèm theo các tham số tìm kiếm, bác sĩ, trạng thái và ngày khám</w:t>
+      </w:r>
+    </w:p>
+    <w:p>
+      <w:pPr>
+        <w:spacing w:before="80" w:after="80" w:line="240" w:lineRule="auto"/>
+        <w:rPr>
+          <w:rFonts w:ascii="Courier New" w:hAnsi="Courier New" w:cs="Courier New"/>
+          <w:sz w:val="19"/>
+        </w:rPr>
+      </w:pPr>
+      <w:r>
+        <w:rPr>
+          <w:rFonts w:ascii="Courier New" w:hAnsi="Courier New" w:cs="Courier New"/>
+          <w:sz w:val="19"/>
+        </w:rPr>
+        <w:t>export const apiGetDanhSachTiepNhan = async ({ search = '', maNV = '', trangThai = '', ngayKham = '', page = 1, limit = 50 } = {}) =&gt; {</w:t>
       </w:r>
     </w:p>
     <w:p>
@@ -269,23 +269,23 @@
           <w:rFonts w:ascii="Courier New" w:hAnsi="Courier New" w:cs="Courier New"/>
           <w:sz w:val="19"/>
         </w:rPr>
-        <w:t xml:space="preserve">  if (maNV) queryParams.append('maNV', maNV);</w:t>
-      </w:r>
-    </w:p>
-    <w:p>
-      <w:pPr>
-        <w:spacing w:before="80" w:after="80" w:line="240" w:lineRule="auto"/>
-        <w:rPr>
-          <w:rFonts w:ascii="Courier New" w:hAnsi="Courier New" w:cs="Courier New"/>
-          <w:sz w:val="19"/>
-        </w:rPr>
-      </w:pPr>
-      <w:r>
-        <w:rPr>
-          <w:rFonts w:ascii="Courier New" w:hAnsi="Courier New" w:cs="Courier New"/>
-          <w:sz w:val="19"/>
-        </w:rPr>
-        <w:t xml:space="preserve">  if (trangThai !== '' &amp;&amp; trangThai !== null) queryParams.append('trangThai', trangThai);</w:t>
+        <w:t xml:space="preserve">  if (maNV) queryParams.append('maBacSi', maNV);</w:t>
+      </w:r>
+    </w:p>
+    <w:p>
+      <w:pPr>
+        <w:spacing w:before="80" w:after="80" w:line="240" w:lineRule="auto"/>
+        <w:rPr>
+          <w:rFonts w:ascii="Courier New" w:hAnsi="Courier New" w:cs="Courier New"/>
+          <w:sz w:val="19"/>
+        </w:rPr>
+      </w:pPr>
+      <w:r>
+        <w:rPr>
+          <w:rFonts w:ascii="Courier New" w:hAnsi="Courier New" w:cs="Courier New"/>
+          <w:sz w:val="19"/>
+        </w:rPr>
+        <w:t xml:space="preserve">  if (trangThai !== '' &amp;&amp; trangThai !== null &amp;&amp; trangThai !== undefined) queryParams.append('trangThai', trangThai);</w:t>
       </w:r>
     </w:p>
     <w:p>
@@ -344,12 +344,181 @@
           <w:sz w:val="19"/>
         </w:rPr>
       </w:pPr>
-      <w:r>
-        <w:rPr>
-          <w:rFonts w:ascii="Courier New" w:hAnsi="Courier New" w:cs="Courier New"/>
-          <w:sz w:val="19"/>
-        </w:rPr>
-        <w:t xml:space="preserve">  return await apiFetch(`/TiepDon/danh-sach?` + queryParams.toString());</w:t>
+    </w:p>
+    <w:p>
+      <w:pPr>
+        <w:spacing w:before="80" w:after="80" w:line="240" w:lineRule="auto"/>
+        <w:rPr>
+          <w:rFonts w:ascii="Courier New" w:hAnsi="Courier New" w:cs="Courier New"/>
+          <w:sz w:val="19"/>
+        </w:rPr>
+      </w:pPr>
+      <w:r>
+        <w:rPr>
+          <w:rFonts w:ascii="Courier New" w:hAnsi="Courier New" w:cs="Courier New"/>
+          <w:sz w:val="19"/>
+        </w:rPr>
+        <w:t xml:space="preserve">  const res = await apiFetch(`/TiepDon/danh-sach?${queryParams.toString()}`);</w:t>
+      </w:r>
+    </w:p>
+    <w:p>
+      <w:pPr>
+        <w:spacing w:before="80" w:after="80" w:line="240" w:lineRule="auto"/>
+        <w:rPr>
+          <w:rFonts w:ascii="Courier New" w:hAnsi="Courier New" w:cs="Courier New"/>
+          <w:sz w:val="19"/>
+        </w:rPr>
+      </w:pPr>
+      <w:r>
+        <w:rPr>
+          <w:rFonts w:ascii="Courier New" w:hAnsi="Courier New" w:cs="Courier New"/>
+          <w:sz w:val="19"/>
+        </w:rPr>
+        <w:t xml:space="preserve">  if (res &amp;&amp; res.data) {</w:t>
+      </w:r>
+    </w:p>
+    <w:p>
+      <w:pPr>
+        <w:spacing w:before="80" w:after="80" w:line="240" w:lineRule="auto"/>
+        <w:rPr>
+          <w:rFonts w:ascii="Courier New" w:hAnsi="Courier New" w:cs="Courier New"/>
+          <w:sz w:val="19"/>
+        </w:rPr>
+      </w:pPr>
+      <w:r>
+        <w:rPr>
+          <w:rFonts w:ascii="Courier New" w:hAnsi="Courier New" w:cs="Courier New"/>
+          <w:sz w:val="19"/>
+        </w:rPr>
+        <w:t xml:space="preserve">    res.data = res.data.map(item =&gt; ({</w:t>
+      </w:r>
+    </w:p>
+    <w:p>
+      <w:pPr>
+        <w:spacing w:before="80" w:after="80" w:line="240" w:lineRule="auto"/>
+        <w:rPr>
+          <w:rFonts w:ascii="Courier New" w:hAnsi="Courier New" w:cs="Courier New"/>
+          <w:sz w:val="19"/>
+        </w:rPr>
+      </w:pPr>
+      <w:r>
+        <w:rPr>
+          <w:rFonts w:ascii="Courier New" w:hAnsi="Courier New" w:cs="Courier New"/>
+          <w:sz w:val="19"/>
+        </w:rPr>
+        <w:t xml:space="preserve">      ...item,</w:t>
+      </w:r>
+    </w:p>
+    <w:p>
+      <w:pPr>
+        <w:spacing w:before="80" w:after="80" w:line="240" w:lineRule="auto"/>
+        <w:rPr>
+          <w:rFonts w:ascii="Courier New" w:hAnsi="Courier New" w:cs="Courier New"/>
+          <w:sz w:val="19"/>
+        </w:rPr>
+      </w:pPr>
+      <w:r>
+        <w:rPr>
+          <w:rFonts w:ascii="Courier New" w:hAnsi="Courier New" w:cs="Courier New"/>
+          <w:sz w:val="19"/>
+        </w:rPr>
+        <w:t xml:space="preserve">      maBacSi: item.maBacSi || item.maNV,</w:t>
+      </w:r>
+    </w:p>
+    <w:p>
+      <w:pPr>
+        <w:spacing w:before="80" w:after="80" w:line="240" w:lineRule="auto"/>
+        <w:rPr>
+          <w:rFonts w:ascii="Courier New" w:hAnsi="Courier New" w:cs="Courier New"/>
+          <w:sz w:val="19"/>
+        </w:rPr>
+      </w:pPr>
+      <w:r>
+        <w:rPr>
+          <w:rFonts w:ascii="Courier New" w:hAnsi="Courier New" w:cs="Courier New"/>
+          <w:sz w:val="19"/>
+        </w:rPr>
+        <w:t xml:space="preserve">      tenBacSi: item.tenBacSi || item.tenNhanVien,</w:t>
+      </w:r>
+    </w:p>
+    <w:p>
+      <w:pPr>
+        <w:spacing w:before="80" w:after="80" w:line="240" w:lineRule="auto"/>
+        <w:rPr>
+          <w:rFonts w:ascii="Courier New" w:hAnsi="Courier New" w:cs="Courier New"/>
+          <w:sz w:val="19"/>
+        </w:rPr>
+      </w:pPr>
+      <w:r>
+        <w:rPr>
+          <w:rFonts w:ascii="Courier New" w:hAnsi="Courier New" w:cs="Courier New"/>
+          <w:sz w:val="19"/>
+        </w:rPr>
+        <w:t xml:space="preserve">      trangThai: item.trangThaiKham,</w:t>
+      </w:r>
+    </w:p>
+    <w:p>
+      <w:pPr>
+        <w:spacing w:before="80" w:after="80" w:line="240" w:lineRule="auto"/>
+        <w:rPr>
+          <w:rFonts w:ascii="Courier New" w:hAnsi="Courier New" w:cs="Courier New"/>
+          <w:sz w:val="19"/>
+        </w:rPr>
+      </w:pPr>
+      <w:r>
+        <w:rPr>
+          <w:rFonts w:ascii="Courier New" w:hAnsi="Courier New" w:cs="Courier New"/>
+          <w:sz w:val="19"/>
+        </w:rPr>
+        <w:t xml:space="preserve">      trangThaiKham: item.trangThaiKham</w:t>
+      </w:r>
+    </w:p>
+    <w:p>
+      <w:pPr>
+        <w:spacing w:before="80" w:after="80" w:line="240" w:lineRule="auto"/>
+        <w:rPr>
+          <w:rFonts w:ascii="Courier New" w:hAnsi="Courier New" w:cs="Courier New"/>
+          <w:sz w:val="19"/>
+        </w:rPr>
+      </w:pPr>
+      <w:r>
+        <w:rPr>
+          <w:rFonts w:ascii="Courier New" w:hAnsi="Courier New" w:cs="Courier New"/>
+          <w:sz w:val="19"/>
+        </w:rPr>
+        <w:t xml:space="preserve">    }));</w:t>
+      </w:r>
+    </w:p>
+    <w:p>
+      <w:pPr>
+        <w:spacing w:before="80" w:after="80" w:line="240" w:lineRule="auto"/>
+        <w:rPr>
+          <w:rFonts w:ascii="Courier New" w:hAnsi="Courier New" w:cs="Courier New"/>
+          <w:sz w:val="19"/>
+        </w:rPr>
+      </w:pPr>
+      <w:r>
+        <w:rPr>
+          <w:rFonts w:ascii="Courier New" w:hAnsi="Courier New" w:cs="Courier New"/>
+          <w:sz w:val="19"/>
+        </w:rPr>
+        <w:t xml:space="preserve">  }</w:t>
+      </w:r>
+    </w:p>
+    <w:p>
+      <w:pPr>
+        <w:spacing w:before="80" w:after="80" w:line="240" w:lineRule="auto"/>
+        <w:rPr>
+          <w:rFonts w:ascii="Courier New" w:hAnsi="Courier New" w:cs="Courier New"/>
+          <w:sz w:val="19"/>
+        </w:rPr>
+      </w:pPr>
+      <w:r>
+        <w:rPr>
+          <w:rFonts w:ascii="Courier New" w:hAnsi="Courier New" w:cs="Courier New"/>
+          <w:sz w:val="19"/>
+        </w:rPr>
+        <w:t xml:space="preserve">  return res;</w:t>
       </w:r>
     </w:p>
     <w:p>
@@ -401,7 +570,7 @@
           <w:b/>
           <w:sz w:val="26"/>
         </w:rPr>
-        <w:t>3.1. Khởi tạo các State lưu trữ Bộ lọc và Kết quả (Dòng 29 - 45)</w:t>
+        <w:t>3.1. Khởi tạo các State lưu trữ Bộ lọc và Kết quả (Dòng 29 - 44)</w:t>
       </w:r>
     </w:p>
     <w:p>
@@ -513,7 +682,7 @@
           <w:rFonts w:ascii="Courier New" w:hAnsi="Courier New" w:cs="Courier New"/>
           <w:sz w:val="19"/>
         </w:rPr>
-        <w:t xml:space="preserve">  d.setDate(d.getDate() - 30); // Lọc mặc định trong vòng 30 ngày qua</w:t>
+        <w:t xml:space="preserve">  d.setDate(d.getDate() - 30);</w:t>
       </w:r>
     </w:p>
     <w:p>
@@ -595,7 +764,7 @@
           <w:b/>
           <w:sz w:val="26"/>
         </w:rPr>
-        <w:t>3.2. Hàm lấy khoảng ngày và Tải song song danh sách qua Promise.all (Dòng 47 - 128)</w:t>
+        <w:t>3.2. Hàm lấy khoảng ngày và Tải song song danh sách qua Promise.all (Dòng 47 - 87, Dòng 90 - 128)</w:t>
       </w:r>
     </w:p>
     <w:p>
@@ -892,32 +1061,80 @@
           <w:rFonts w:ascii="Courier New" w:hAnsi="Courier New" w:cs="Courier New"/>
           <w:sz w:val="19"/>
         </w:rPr>
-        <w:t xml:space="preserve">    if (dates.length === 0) return setDsPhieuKham([]);</w:t>
-      </w:r>
-    </w:p>
-    <w:p>
-      <w:pPr>
-        <w:spacing w:before="80" w:after="80" w:line="240" w:lineRule="auto"/>
-        <w:rPr>
-          <w:rFonts w:ascii="Courier New" w:hAnsi="Courier New" w:cs="Courier New"/>
-          <w:sz w:val="19"/>
-        </w:rPr>
-      </w:pPr>
-    </w:p>
-    <w:p>
-      <w:pPr>
-        <w:spacing w:before="80" w:after="80" w:line="240" w:lineRule="auto"/>
-        <w:rPr>
-          <w:rFonts w:ascii="Courier New" w:hAnsi="Courier New" w:cs="Courier New"/>
-          <w:sz w:val="19"/>
-        </w:rPr>
-      </w:pPr>
-      <w:r>
-        <w:rPr>
-          <w:rFonts w:ascii="Courier New" w:hAnsi="Courier New" w:cs="Courier New"/>
-          <w:sz w:val="19"/>
-        </w:rPr>
-        <w:t xml:space="preserve">    // Gọi đồng thời API cho từng ngày trong khoảng bằng cách map sang mảng Promise</w:t>
+        <w:t xml:space="preserve">    if (dates.length === 0) {</w:t>
+      </w:r>
+    </w:p>
+    <w:p>
+      <w:pPr>
+        <w:spacing w:before="80" w:after="80" w:line="240" w:lineRule="auto"/>
+        <w:rPr>
+          <w:rFonts w:ascii="Courier New" w:hAnsi="Courier New" w:cs="Courier New"/>
+          <w:sz w:val="19"/>
+        </w:rPr>
+      </w:pPr>
+      <w:r>
+        <w:rPr>
+          <w:rFonts w:ascii="Courier New" w:hAnsi="Courier New" w:cs="Courier New"/>
+          <w:sz w:val="19"/>
+        </w:rPr>
+        <w:t xml:space="preserve">      setDsPhieuKham([]);</w:t>
+      </w:r>
+    </w:p>
+    <w:p>
+      <w:pPr>
+        <w:spacing w:before="80" w:after="80" w:line="240" w:lineRule="auto"/>
+        <w:rPr>
+          <w:rFonts w:ascii="Courier New" w:hAnsi="Courier New" w:cs="Courier New"/>
+          <w:sz w:val="19"/>
+        </w:rPr>
+      </w:pPr>
+      <w:r>
+        <w:rPr>
+          <w:rFonts w:ascii="Courier New" w:hAnsi="Courier New" w:cs="Courier New"/>
+          <w:sz w:val="19"/>
+        </w:rPr>
+        <w:t xml:space="preserve">      return;</w:t>
+      </w:r>
+    </w:p>
+    <w:p>
+      <w:pPr>
+        <w:spacing w:before="80" w:after="80" w:line="240" w:lineRule="auto"/>
+        <w:rPr>
+          <w:rFonts w:ascii="Courier New" w:hAnsi="Courier New" w:cs="Courier New"/>
+          <w:sz w:val="19"/>
+        </w:rPr>
+      </w:pPr>
+      <w:r>
+        <w:rPr>
+          <w:rFonts w:ascii="Courier New" w:hAnsi="Courier New" w:cs="Courier New"/>
+          <w:sz w:val="19"/>
+        </w:rPr>
+        <w:t xml:space="preserve">    }</w:t>
+      </w:r>
+    </w:p>
+    <w:p>
+      <w:pPr>
+        <w:spacing w:before="80" w:after="80" w:line="240" w:lineRule="auto"/>
+        <w:rPr>
+          <w:rFonts w:ascii="Courier New" w:hAnsi="Courier New" w:cs="Courier New"/>
+          <w:sz w:val="19"/>
+        </w:rPr>
+      </w:pPr>
+    </w:p>
+    <w:p>
+      <w:pPr>
+        <w:spacing w:before="80" w:after="80" w:line="240" w:lineRule="auto"/>
+        <w:rPr>
+          <w:rFonts w:ascii="Courier New" w:hAnsi="Courier New" w:cs="Courier New"/>
+          <w:sz w:val="19"/>
+        </w:rPr>
+      </w:pPr>
+      <w:r>
+        <w:rPr>
+          <w:rFonts w:ascii="Courier New" w:hAnsi="Courier New" w:cs="Courier New"/>
+          <w:sz w:val="19"/>
+        </w:rPr>
+        <w:t xml:space="preserve">    // Gọi đồng thời API cho từng ngày trong khoảng đã chọn</w:t>
       </w:r>
     </w:p>
     <w:p>
@@ -1029,7 +1246,23 @@
           <w:rFonts w:ascii="Courier New" w:hAnsi="Courier New" w:cs="Courier New"/>
           <w:sz w:val="19"/>
         </w:rPr>
-        <w:t xml:space="preserve">        page: 1, limit: 100</w:t>
+        <w:t xml:space="preserve">        page: 1,</w:t>
+      </w:r>
+    </w:p>
+    <w:p>
+      <w:pPr>
+        <w:spacing w:before="80" w:after="80" w:line="240" w:lineRule="auto"/>
+        <w:rPr>
+          <w:rFonts w:ascii="Courier New" w:hAnsi="Courier New" w:cs="Courier New"/>
+          <w:sz w:val="19"/>
+        </w:rPr>
+      </w:pPr>
+      <w:r>
+        <w:rPr>
+          <w:rFonts w:ascii="Courier New" w:hAnsi="Courier New" w:cs="Courier New"/>
+          <w:sz w:val="19"/>
+        </w:rPr>
+        <w:t xml:space="preserve">        limit: 100</w:t>
       </w:r>
     </w:p>
     <w:p>
@@ -1072,12 +1305,21 @@
           <w:sz w:val="19"/>
         </w:rPr>
       </w:pPr>
-      <w:r>
-        <w:rPr>
-          <w:rFonts w:ascii="Courier New" w:hAnsi="Courier New" w:cs="Courier New"/>
-          <w:sz w:val="19"/>
-        </w:rPr>
-        <w:t xml:space="preserve">    const responses = await Promise.all(requests); // Tải song song</w:t>
+    </w:p>
+    <w:p>
+      <w:pPr>
+        <w:spacing w:before="80" w:after="80" w:line="240" w:lineRule="auto"/>
+        <w:rPr>
+          <w:rFonts w:ascii="Courier New" w:hAnsi="Courier New" w:cs="Courier New"/>
+          <w:sz w:val="19"/>
+        </w:rPr>
+      </w:pPr>
+      <w:r>
+        <w:rPr>
+          <w:rFonts w:ascii="Courier New" w:hAnsi="Courier New" w:cs="Courier New"/>
+          <w:sz w:val="19"/>
+        </w:rPr>
+        <w:t xml:space="preserve">    const responses = await Promise.all(requests);</w:t>
       </w:r>
     </w:p>
     <w:p>
@@ -1125,7 +1367,39 @@
           <w:rFonts w:ascii="Courier New" w:hAnsi="Courier New" w:cs="Courier New"/>
           <w:sz w:val="19"/>
         </w:rPr>
-        <w:t xml:space="preserve">      if (res &amp;&amp; res.data) mergedData = mergedData.concat(res.data);</w:t>
+        <w:t xml:space="preserve">      if (res &amp;&amp; res.data) {</w:t>
+      </w:r>
+    </w:p>
+    <w:p>
+      <w:pPr>
+        <w:spacing w:before="80" w:after="80" w:line="240" w:lineRule="auto"/>
+        <w:rPr>
+          <w:rFonts w:ascii="Courier New" w:hAnsi="Courier New" w:cs="Courier New"/>
+          <w:sz w:val="19"/>
+        </w:rPr>
+      </w:pPr>
+      <w:r>
+        <w:rPr>
+          <w:rFonts w:ascii="Courier New" w:hAnsi="Courier New" w:cs="Courier New"/>
+          <w:sz w:val="19"/>
+        </w:rPr>
+        <w:t xml:space="preserve">        mergedData = mergedData.concat(res.data);</w:t>
+      </w:r>
+    </w:p>
+    <w:p>
+      <w:pPr>
+        <w:spacing w:before="80" w:after="80" w:line="240" w:lineRule="auto"/>
+        <w:rPr>
+          <w:rFonts w:ascii="Courier New" w:hAnsi="Courier New" w:cs="Courier New"/>
+          <w:sz w:val="19"/>
+        </w:rPr>
+      </w:pPr>
+      <w:r>
+        <w:rPr>
+          <w:rFonts w:ascii="Courier New" w:hAnsi="Courier New" w:cs="Courier New"/>
+          <w:sz w:val="19"/>
+        </w:rPr>
+        <w:t xml:space="preserve">      }</w:t>
       </w:r>
     </w:p>
     <w:p>
@@ -1157,22 +1431,6 @@
           <w:rFonts w:ascii="Courier New" w:hAnsi="Courier New" w:cs="Courier New"/>
           <w:sz w:val="19"/>
         </w:rPr>
-        <w:t xml:space="preserve">    // Sắp xếp các lượt khám mới nhất lên đầu</w:t>
-      </w:r>
-    </w:p>
-    <w:p>
-      <w:pPr>
-        <w:spacing w:before="80" w:after="80" w:line="240" w:lineRule="auto"/>
-        <w:rPr>
-          <w:rFonts w:ascii="Courier New" w:hAnsi="Courier New" w:cs="Courier New"/>
-          <w:sz w:val="19"/>
-        </w:rPr>
-      </w:pPr>
-      <w:r>
-        <w:rPr>
-          <w:rFonts w:ascii="Courier New" w:hAnsi="Courier New" w:cs="Courier New"/>
-          <w:sz w:val="19"/>
-        </w:rPr>
         <w:t xml:space="preserve">    mergedData.sort((a, b) =&gt; new Date(b.ngayKham) - new Date(a.ngayKham));</w:t>
       </w:r>
     </w:p>
@@ -1221,23 +1479,71 @@
           <w:rFonts w:ascii="Courier New" w:hAnsi="Courier New" w:cs="Courier New"/>
           <w:sz w:val="19"/>
         </w:rPr>
-        <w:t xml:space="preserve">    showError('Không thể kết nối dữ liệu từ máy chủ.');</w:t>
-      </w:r>
-    </w:p>
-    <w:p>
-      <w:pPr>
-        <w:spacing w:before="80" w:after="80" w:line="240" w:lineRule="auto"/>
-        <w:rPr>
-          <w:rFonts w:ascii="Courier New" w:hAnsi="Courier New" w:cs="Courier New"/>
-          <w:sz w:val="19"/>
-        </w:rPr>
-      </w:pPr>
-      <w:r>
-        <w:rPr>
-          <w:rFonts w:ascii="Courier New" w:hAnsi="Courier New" w:cs="Courier New"/>
-          <w:sz w:val="19"/>
-        </w:rPr>
-        <w:t xml:space="preserve">  } finally { setLoading(false); }</w:t>
+        <w:t xml:space="preserve">    console.error('Lỗi tải danh sách tiếp nhận:', err);</w:t>
+      </w:r>
+    </w:p>
+    <w:p>
+      <w:pPr>
+        <w:spacing w:before="80" w:after="80" w:line="240" w:lineRule="auto"/>
+        <w:rPr>
+          <w:rFonts w:ascii="Courier New" w:hAnsi="Courier New" w:cs="Courier New"/>
+          <w:sz w:val="19"/>
+        </w:rPr>
+      </w:pPr>
+      <w:r>
+        <w:rPr>
+          <w:rFonts w:ascii="Courier New" w:hAnsi="Courier New" w:cs="Courier New"/>
+          <w:sz w:val="19"/>
+        </w:rPr>
+        <w:t xml:space="preserve">    showError('Không thể kết nối dữ liệu từ máy chủ. Xin hãy thử lại.');</w:t>
+      </w:r>
+    </w:p>
+    <w:p>
+      <w:pPr>
+        <w:spacing w:before="80" w:after="80" w:line="240" w:lineRule="auto"/>
+        <w:rPr>
+          <w:rFonts w:ascii="Courier New" w:hAnsi="Courier New" w:cs="Courier New"/>
+          <w:sz w:val="19"/>
+        </w:rPr>
+      </w:pPr>
+      <w:r>
+        <w:rPr>
+          <w:rFonts w:ascii="Courier New" w:hAnsi="Courier New" w:cs="Courier New"/>
+          <w:sz w:val="19"/>
+        </w:rPr>
+        <w:t xml:space="preserve">  } finally {</w:t>
+      </w:r>
+    </w:p>
+    <w:p>
+      <w:pPr>
+        <w:spacing w:before="80" w:after="80" w:line="240" w:lineRule="auto"/>
+        <w:rPr>
+          <w:rFonts w:ascii="Courier New" w:hAnsi="Courier New" w:cs="Courier New"/>
+          <w:sz w:val="19"/>
+        </w:rPr>
+      </w:pPr>
+      <w:r>
+        <w:rPr>
+          <w:rFonts w:ascii="Courier New" w:hAnsi="Courier New" w:cs="Courier New"/>
+          <w:sz w:val="19"/>
+        </w:rPr>
+        <w:t xml:space="preserve">    setLoading(false);</w:t>
+      </w:r>
+    </w:p>
+    <w:p>
+      <w:pPr>
+        <w:spacing w:before="80" w:after="80" w:line="240" w:lineRule="auto"/>
+        <w:rPr>
+          <w:rFonts w:ascii="Courier New" w:hAnsi="Courier New" w:cs="Courier New"/>
+          <w:sz w:val="19"/>
+        </w:rPr>
+      </w:pPr>
+      <w:r>
+        <w:rPr>
+          <w:rFonts w:ascii="Courier New" w:hAnsi="Courier New" w:cs="Courier New"/>
+          <w:sz w:val="19"/>
+        </w:rPr>
+        <w:t xml:space="preserve">  }</w:t>
       </w:r>
     </w:p>
     <w:p>
@@ -1353,7 +1659,7 @@
           <w:b/>
           <w:sz w:val="26"/>
         </w:rPr>
-        <w:t>3.4. Các hàm định dạng Chuỗi ngày giờ và Ngày sinh (Dòng 136 - 150)</w:t>
+        <w:t>3.4. Các hàm định dạng Chuỗi ngày giờ và Ngày sinh (Dòng 136 - 149)</w:t>
       </w:r>
     </w:p>
     <w:p>
@@ -2016,7 +2322,7 @@
     <w:link w:val="Heading1Char"/>
     <w:uiPriority w:val="9"/>
     <w:qFormat/>
-    <w:rsid w:val="00923C51"/>
+    <w:rsid w:val="00D82FE6"/>
     <w:pPr>
       <w:keepNext/>
       <w:keepLines/>
@@ -2039,7 +2345,7 @@
     <w:semiHidden/>
     <w:unhideWhenUsed/>
     <w:qFormat/>
-    <w:rsid w:val="00923C51"/>
+    <w:rsid w:val="00D82FE6"/>
     <w:pPr>
       <w:keepNext/>
       <w:keepLines/>
@@ -2062,7 +2368,7 @@
     <w:semiHidden/>
     <w:unhideWhenUsed/>
     <w:qFormat/>
-    <w:rsid w:val="00923C51"/>
+    <w:rsid w:val="00D82FE6"/>
     <w:pPr>
       <w:keepNext/>
       <w:keepLines/>
@@ -2085,7 +2391,7 @@
     <w:semiHidden/>
     <w:unhideWhenUsed/>
     <w:qFormat/>
-    <w:rsid w:val="00923C51"/>
+    <w:rsid w:val="00D82FE6"/>
     <w:pPr>
       <w:keepNext/>
       <w:keepLines/>
@@ -2108,7 +2414,7 @@
     <w:semiHidden/>
     <w:unhideWhenUsed/>
     <w:qFormat/>
-    <w:rsid w:val="00923C51"/>
+    <w:rsid w:val="00D82FE6"/>
     <w:pPr>
       <w:keepNext/>
       <w:keepLines/>
@@ -2129,7 +2435,7 @@
     <w:semiHidden/>
     <w:unhideWhenUsed/>
     <w:qFormat/>
-    <w:rsid w:val="00923C51"/>
+    <w:rsid w:val="00D82FE6"/>
     <w:pPr>
       <w:keepNext/>
       <w:keepLines/>
@@ -2152,7 +2458,7 @@
     <w:semiHidden/>
     <w:unhideWhenUsed/>
     <w:qFormat/>
-    <w:rsid w:val="00923C51"/>
+    <w:rsid w:val="00D82FE6"/>
     <w:pPr>
       <w:keepNext/>
       <w:keepLines/>
@@ -2173,7 +2479,7 @@
     <w:semiHidden/>
     <w:unhideWhenUsed/>
     <w:qFormat/>
-    <w:rsid w:val="00923C51"/>
+    <w:rsid w:val="00D82FE6"/>
     <w:pPr>
       <w:keepNext/>
       <w:keepLines/>
@@ -2196,7 +2502,7 @@
     <w:semiHidden/>
     <w:unhideWhenUsed/>
     <w:qFormat/>
-    <w:rsid w:val="00923C51"/>
+    <w:rsid w:val="00D82FE6"/>
     <w:pPr>
       <w:keepNext/>
       <w:keepLines/>
@@ -2240,7 +2546,7 @@
     <w:basedOn w:val="DefaultParagraphFont"/>
     <w:link w:val="Heading1"/>
     <w:uiPriority w:val="9"/>
-    <w:rsid w:val="00923C51"/>
+    <w:rsid w:val="00D82FE6"/>
     <w:rPr>
       <w:rFonts w:asciiTheme="majorHAnsi" w:eastAsiaTheme="majorEastAsia" w:hAnsiTheme="majorHAnsi" w:cstheme="majorBidi"/>
       <w:color w:val="0F4761" w:themeColor="accent1" w:themeShade="BF"/>
@@ -2254,7 +2560,7 @@
     <w:link w:val="Heading2"/>
     <w:uiPriority w:val="9"/>
     <w:semiHidden/>
-    <w:rsid w:val="00923C51"/>
+    <w:rsid w:val="00D82FE6"/>
     <w:rPr>
       <w:rFonts w:asciiTheme="majorHAnsi" w:eastAsiaTheme="majorEastAsia" w:hAnsiTheme="majorHAnsi" w:cstheme="majorBidi"/>
       <w:color w:val="0F4761" w:themeColor="accent1" w:themeShade="BF"/>
@@ -2268,7 +2574,7 @@
     <w:link w:val="Heading3"/>
     <w:uiPriority w:val="9"/>
     <w:semiHidden/>
-    <w:rsid w:val="00923C51"/>
+    <w:rsid w:val="00D82FE6"/>
     <w:rPr>
       <w:rFonts w:eastAsiaTheme="majorEastAsia" w:cstheme="majorBidi"/>
       <w:color w:val="0F4761" w:themeColor="accent1" w:themeShade="BF"/>
@@ -2282,7 +2588,7 @@
     <w:link w:val="Heading4"/>
     <w:uiPriority w:val="9"/>
     <w:semiHidden/>
-    <w:rsid w:val="00923C51"/>
+    <w:rsid w:val="00D82FE6"/>
     <w:rPr>
       <w:rFonts w:eastAsiaTheme="majorEastAsia" w:cstheme="majorBidi"/>
       <w:i/>
@@ -2296,7 +2602,7 @@
     <w:link w:val="Heading5"/>
     <w:uiPriority w:val="9"/>
     <w:semiHidden/>
-    <w:rsid w:val="00923C51"/>
+    <w:rsid w:val="00D82FE6"/>
     <w:rPr>
       <w:rFonts w:eastAsiaTheme="majorEastAsia" w:cstheme="majorBidi"/>
       <w:color w:val="0F4761" w:themeColor="accent1" w:themeShade="BF"/>
@@ -2308,7 +2614,7 @@
     <w:link w:val="Heading6"/>
     <w:uiPriority w:val="9"/>
     <w:semiHidden/>
-    <w:rsid w:val="00923C51"/>
+    <w:rsid w:val="00D82FE6"/>
     <w:rPr>
       <w:rFonts w:eastAsiaTheme="majorEastAsia" w:cstheme="majorBidi"/>
       <w:i/>
@@ -2322,7 +2628,7 @@
     <w:link w:val="Heading7"/>
     <w:uiPriority w:val="9"/>
     <w:semiHidden/>
-    <w:rsid w:val="00923C51"/>
+    <w:rsid w:val="00D82FE6"/>
     <w:rPr>
       <w:rFonts w:eastAsiaTheme="majorEastAsia" w:cstheme="majorBidi"/>
       <w:color w:val="595959" w:themeColor="text1" w:themeTint="A6"/>
@@ -2334,7 +2640,7 @@
     <w:link w:val="Heading8"/>
     <w:uiPriority w:val="9"/>
     <w:semiHidden/>
-    <w:rsid w:val="00923C51"/>
+    <w:rsid w:val="00D82FE6"/>
     <w:rPr>
       <w:rFonts w:eastAsiaTheme="majorEastAsia" w:cstheme="majorBidi"/>
       <w:i/>
@@ -2348,7 +2654,7 @@
     <w:link w:val="Heading9"/>
     <w:uiPriority w:val="9"/>
     <w:semiHidden/>
-    <w:rsid w:val="00923C51"/>
+    <w:rsid w:val="00D82FE6"/>
     <w:rPr>
       <w:rFonts w:eastAsiaTheme="majorEastAsia" w:cstheme="majorBidi"/>
       <w:color w:val="272727" w:themeColor="text1" w:themeTint="D8"/>
@@ -2361,7 +2667,7 @@
     <w:link w:val="TitleChar"/>
     <w:uiPriority w:val="10"/>
     <w:qFormat/>
-    <w:rsid w:val="00923C51"/>
+    <w:rsid w:val="00D82FE6"/>
     <w:pPr>
       <w:spacing w:after="80" w:line="240" w:lineRule="auto"/>
       <w:contextualSpacing/>
@@ -2379,7 +2685,7 @@
     <w:basedOn w:val="DefaultParagraphFont"/>
     <w:link w:val="Title"/>
     <w:uiPriority w:val="10"/>
-    <w:rsid w:val="00923C51"/>
+    <w:rsid w:val="00D82FE6"/>
     <w:rPr>
       <w:rFonts w:asciiTheme="majorHAnsi" w:eastAsiaTheme="majorEastAsia" w:hAnsiTheme="majorHAnsi" w:cstheme="majorBidi"/>
       <w:spacing w:val="-10"/>
@@ -2395,7 +2701,7 @@
     <w:link w:val="SubtitleChar"/>
     <w:uiPriority w:val="11"/>
     <w:qFormat/>
-    <w:rsid w:val="00923C51"/>
+    <w:rsid w:val="00D82FE6"/>
     <w:pPr>
       <w:numPr>
         <w:ilvl w:val="1"/>
@@ -2414,7 +2720,7 @@
     <w:basedOn w:val="DefaultParagraphFont"/>
     <w:link w:val="Subtitle"/>
     <w:uiPriority w:val="11"/>
-    <w:rsid w:val="00923C51"/>
+    <w:rsid w:val="00D82FE6"/>
     <w:rPr>
       <w:rFonts w:eastAsiaTheme="majorEastAsia" w:cstheme="majorBidi"/>
       <w:color w:val="595959" w:themeColor="text1" w:themeTint="A6"/>
@@ -2430,7 +2736,7 @@
     <w:link w:val="QuoteChar"/>
     <w:uiPriority w:val="29"/>
     <w:qFormat/>
-    <w:rsid w:val="00923C51"/>
+    <w:rsid w:val="00D82FE6"/>
     <w:pPr>
       <w:spacing w:before="160"/>
       <w:jc w:val="center"/>
@@ -2446,7 +2752,7 @@
     <w:basedOn w:val="DefaultParagraphFont"/>
     <w:link w:val="Quote"/>
     <w:uiPriority w:val="29"/>
-    <w:rsid w:val="00923C51"/>
+    <w:rsid w:val="00D82FE6"/>
     <w:rPr>
       <w:i/>
       <w:iCs/>
@@ -2458,7 +2764,7 @@
     <w:basedOn w:val="Normal"/>
     <w:uiPriority w:val="34"/>
     <w:qFormat/>
-    <w:rsid w:val="00923C51"/>
+    <w:rsid w:val="00D82FE6"/>
     <w:pPr>
       <w:ind w:left="720"/>
       <w:contextualSpacing/>
@@ -2469,7 +2775,7 @@
     <w:basedOn w:val="DefaultParagraphFont"/>
     <w:uiPriority w:val="21"/>
     <w:qFormat/>
-    <w:rsid w:val="00923C51"/>
+    <w:rsid w:val="00D82FE6"/>
     <w:rPr>
       <w:i/>
       <w:iCs/>
@@ -2483,7 +2789,7 @@
     <w:link w:val="IntenseQuoteChar"/>
     <w:uiPriority w:val="30"/>
     <w:qFormat/>
-    <w:rsid w:val="00923C51"/>
+    <w:rsid w:val="00D82FE6"/>
     <w:pPr>
       <w:pBdr>
         <w:top w:val="single" w:sz="4" w:space="10" w:color="0F4761" w:themeColor="accent1" w:themeShade="BF"/>
@@ -2504,7 +2810,7 @@
     <w:basedOn w:val="DefaultParagraphFont"/>
     <w:link w:val="IntenseQuote"/>
     <w:uiPriority w:val="30"/>
-    <w:rsid w:val="00923C51"/>
+    <w:rsid w:val="00D82FE6"/>
     <w:rPr>
       <w:i/>
       <w:iCs/>
@@ -2516,7 +2822,7 @@
     <w:basedOn w:val="DefaultParagraphFont"/>
     <w:uiPriority w:val="32"/>
     <w:qFormat/>
-    <w:rsid w:val="00923C51"/>
+    <w:rsid w:val="00D82FE6"/>
     <w:rPr>
       <w:b/>
       <w:bCs/>

</xml_diff>